<commit_message>
docs: atualizar documentação final para seguir o roadmap de 8 capítulos e adicionar o glossário
</commit_message>
<xml_diff>
--- a/Documentação final - Mybuddy/Template_de_documentação.docx
+++ b/Documentação final - Mybuddy/Template_de_documentação.docx
@@ -310,9 +310,53 @@
             <w:r>
               <w:rPr>
                 <w:rFonts w:ascii="Arial" w:hAnsi="Arial"/>
-                <w:sz w:val="21"/>
-              </w:rPr>
-              <w:t>2. JUSTIFICATIVA ................................................................................................................................ 4 3. OBJETIVO ......................................................................................................................................... 5 3.1 OBJETIVO GERAL .................................................................................................................... 5 3.2 OBJETIVOS ESPECÍFICOS ..................................................................................................... 5 4. DESENVOLVIMENTO ....................................................................................................................... 6 4.1 ANÁLISE DE MERCADO .......................................................................................................... 6 4.2 DOUBLE DIAMOND .................................................................................................................. 6 4.3 ANÁLISE SWOT ........................................................................................................................ 6 4.4 BUSINESS MODEL CANVAS ................................................................................................... 6 4.5 PERSONAS ............................................................................................................................... 6 4.6 MAPA DE EMPATIA .................................................................................................................. 6 4.7 BUSINESS MODEL CANVAS ................................................................................................... 6 4.8 PROTÓTIPO .............................................................................................................................. 6 4.9 …. ............................................................................................................................................... 6 5. CONCLUSÃO .................................................................................................................................... 7 6. REFERÊNCIAS ................................................................................................................................. 8 7. ANEXOS ............................................................................................................................................ 9</w:t>
+                <w:sz w:val="20"/>
+              </w:rPr>
+              <w:t>1.1 CONTEXTO E JUSTIFICATIVA</w:t>
+              <w:br/>
+              <w:br/>
+              <w:br/>
+              <w:t>1.2 METODOLOGIA DE DESCOBERTA (DOUBLE DIAMOND)</w:t>
+              <w:br/>
+              <w:t>O processo de design seguiu o Duplo Diamante:</w:t>
+              <w:br/>
+              <w:t>1. Descobrir: Pesquisa de dores com protetores e adotantes, identificando a fragmentação do ecossistema.</w:t>
+              <w:br/>
+              <w:t>2. Definir: Definição do problema foco como a falta de um hub local de serviços e adoção confiável.</w:t>
+              <w:br/>
+              <w:t>3. Desenvolver: Brainstorming de soluções (Vitrine, Guia de Serviços, Marketplace) e mockups Figma.</w:t>
+              <w:br/>
+              <w:t>4. Entregar: Lançamento do MVP validado por usuários reais e planejado para iterações contínuas.</w:t>
+              <w:br/>
+              <w:br/>
+              <w:t>1.3 ANÁLISE DE MERCADO (SWOT E PREMISSAS CSD)</w:t>
+              <w:br/>
+              <w:t>• Forças: Foco hiperlocal e integração dois-em-um (adotar + cuidar).</w:t>
+              <w:br/>
+              <w:t>• Fraquezas: Recursos de marketing iniciais limitados.</w:t>
+              <w:br/>
+              <w:t>• Oportunidades: Humanização crescente dos pets e repulsa do público à desorganização em redes sociais.</w:t>
+              <w:br/>
+              <w:t>• Ameaças: Baixa adesão inicial e dados desatualizados.</w:t>
+              <w:br/>
+              <w:br/>
+              <w:t>1.4 GLOSSÁRIO DOS TERMOS DO NEGÓCIO (Exigência do TCC)</w:t>
+              <w:br/>
+              <w:t>• Split Payment: Divisão automática de valores de transações financeiras realizada na camada da gateway (Mercado Pago), separando a comissão da plataforma MyBuddy (X%) e o repasse ao lojista/pet shop parceiro (Y%).</w:t>
+              <w:br/>
+              <w:t>• Adotante / Tutor: Usuário final que utiliza a plataforma para passar pelo processo de adoção responsável ou para buscar e usufruir de serviços e produtos para seu pet.</w:t>
+              <w:br/>
+              <w:t>• Protetor Independente: Pessoa física que atua no resgate e cuidados temporários de animais abandonados de forma autônoma, sem possuir o CNPJ de uma ONG formal, usando a plataforma para divulgação.</w:t>
+              <w:br/>
+              <w:t>• Token JWT (JSON Web Token): Token compacto de autenticação stateless utilizado para transmitir de forma segura a identidade do usuário entre o frontend (Angular/Flutter) e a API (Spring Boot).</w:t>
+              <w:br/>
+              <w:t>• Dual Database Strategy: Estratégia de banco de dados híbrida na qual a persistência relacional ACID de transações e agendamentos fica no PostgreSQL, e os perfis flexíveis de usuários, pets e ONGs no MongoDB.</w:t>
+              <w:br/>
+              <w:t>• RESTful Stateless: Estilo de arquitetura de API onde cada requisição do cliente contém toda a informação necessária para ser processada, sem dependência de dados de sessão mantidos no servidor.</w:t>
+              <w:br/>
+              <w:t>• WebSocket: Protocolo que provê canal de comunicação bidirecional full-duplex de baixa latência sobre uma única conexão TCP, utilizado para o chat síncrono entre adotantes e ONGs.</w:t>
+              <w:br/>
+              <w:t>• Keycloak: Solução de código aberto de gerenciamento de identidade e acesso (IAM), responsável pelo Single Sign-On (SSO) e segurança RBAC (controle de rotas por Roles/Funções) da plataforma.</w:t>
             </w:r>
           </w:p>
         </w:tc>
@@ -442,12 +486,11 @@
             <w:r>
               <w:rPr>
                 <w:rFonts w:ascii="Arial" w:hAnsi="Arial"/>
-                <w:sz w:val="21"/>
-              </w:rPr>
-              <w:t>JUSTIFICATIVA DO PROJETO</w:t>
-              <w:br/>
-              <w:br/>
-              <w:t>3. OBJETIVO ......................................................................................................................................... 5 3.1 OBJETIVO GERAL .................................................................................................................... 5 3.2 OBJETIVOS ESPECÍFICOS ..................................................................................................... 5 4. DESENVOLVIMENTO ....................................................................................................................... 6 4.1 ANÁLISE DE MERCADO .......................................................................................................... 6 4.2 DOUBLE DIAMOND .................................................................................................................. 6 4.3 ANÁLISE SWOT ........................................................................................................................ 6 4.4 BUSINESS MODEL CANVAS ................................................................................................... 6 4.5 PERSONAS ............................................................................................................................... 6 4.6 MAPA DE EMPATIA .................................................................................................................. 6 4.7 BUSINESS MODEL CANVAS ................................................................................................... 6 4.8 PROTÓTIPO .............................................................................................................................. 6 4.9 …. ............................................................................................................................................... 6 5. CONCLUSÃO .................................................................................................................................... 7 6. REFERÊNCIAS ................................................................................................................................. 8 7. ANEXOS ............................................................................................................................................ 9</w:t>
+                <w:sz w:val="17"/>
+              </w:rPr>
+              <w:t>2.1 REQUISITOS FUNCIONAIS (SÍNTESE DOS 52 REQUISITOS DO SISTEMA)</w:t>
+              <w:br/>
+              <w:br/>
             </w:r>
           </w:p>
         </w:tc>
@@ -472,18 +515,16 @@
             <w:r>
               <w:rPr>
                 <w:rFonts w:ascii="Arial" w:hAnsi="Arial"/>
-                <w:sz w:val="21"/>
-              </w:rPr>
-              <w:t>OBJETIVOS DO PROJETO</w:t>
-              <w:br/>
-              <w:br/>
-              <w:t>Objetivo Geral:</w:t>
-              <w:br/>
-              <w:br/>
-              <w:br/>
-              <w:t>Objetivos Específicos:</w:t>
-              <w:br/>
-              <w:t>• 4. DESENVOLVIMENTO ....................................................................................................................... 6 4.1 ANÁLISE DE MERCADO .......................................................................................................... 6 4.2 DOUBLE DIAMOND .................................................................................................................. 6 4.3 ANÁLISE SWOT ........................................................................................................................ 6 4.4 BUSINESS MODEL CANVAS ................................................................................................... 6 4.5 PERSONAS ............................................................................................................................... 6 4.6 MAPA DE EMPATIA .................................................................................................................. 6 4.7 BUSINESS MODEL CANVAS ................................................................................................... 6 4.8 PROTÓTIPO .............................................................................................................................. 6 4.9 …. ............................................................................................................................................... 6 5. CONCLUSÃO .................................................................................................................................... 7 6. REFERÊNCIAS ................................................................................................................................. 8 7. ANEXOS ............................................................................................................................................ 9</w:t>
+                <w:sz w:val="17"/>
+              </w:rPr>
+              <w:t>2.2 REQUISITOS NÃO FUNCIONAIS (RNF)</w:t>
+              <w:br/>
+              <w:br/>
+              <w:br/>
+              <w:br/>
+              <w:t>2.3 REGRAS DE NEGÓCIO E CONFORMIDADE LGPD (RN)</w:t>
+              <w:br/>
+              <w:br/>
             </w:r>
           </w:p>
         </w:tc>
@@ -606,7 +647,7 @@
                 <w:rFonts w:ascii="Arial" w:hAnsi="Arial"/>
                 <w:sz w:val="19"/>
               </w:rPr>
-              <w:t>Ator</w:t>
+              <w:t>Arquitetura / Módulo</w:t>
             </w:r>
           </w:p>
         </w:tc>
@@ -633,7 +674,7 @@
                 <w:rFonts w:ascii="Arial" w:hAnsi="Arial"/>
                 <w:sz w:val="19"/>
               </w:rPr>
-              <w:t>Descrição</w:t>
+              <w:t>Estratégia Técnica e Padrão Adotado</w:t>
             </w:r>
           </w:p>
         </w:tc>
@@ -660,7 +701,7 @@
                 <w:rFonts w:ascii="Arial" w:hAnsi="Arial"/>
                 <w:sz w:val="19"/>
               </w:rPr>
-              <w:t>Responsabilidades</w:t>
+              <w:t>Justificativa e Detalhes de Implementação</w:t>
             </w:r>
           </w:p>
         </w:tc>
@@ -693,7 +734,7 @@
                 <w:rFonts w:ascii="Arial" w:hAnsi="Arial"/>
                 <w:sz w:val="19"/>
               </w:rPr>
-              <w:t>Visitante</w:t>
+              <w:t>3.1 Arquitetura Base</w:t>
             </w:r>
           </w:p>
         </w:tc>
@@ -720,7 +761,7 @@
                 <w:rFonts w:ascii="Arial" w:hAnsi="Arial"/>
                 <w:sz w:val="19"/>
               </w:rPr>
-              <w:t>Acesso público à landing page, vitrine de pets e guia de serviços.</w:t>
+              <w:t>RESTful Stateless API + SPA + Mobile</w:t>
             </w:r>
           </w:p>
         </w:tc>
@@ -747,7 +788,7 @@
                 <w:rFonts w:ascii="Arial" w:hAnsi="Arial"/>
                 <w:sz w:val="19"/>
               </w:rPr>
-              <w:t>Visualizar animais para adoção e buscar estabelecimentos locais.</w:t>
+              <w:t>Backend com Spring Boot 3.5.5 expõe endpoints REST. Frontend em Angular com SSR garante renderização otimizada. Mobile compilado de forma nativa em Flutter.</w:t>
             </w:r>
           </w:p>
         </w:tc>
@@ -780,7 +821,7 @@
                 <w:rFonts w:ascii="Arial" w:hAnsi="Arial"/>
                 <w:sz w:val="19"/>
               </w:rPr>
-              <w:t>Adotante / Tutor</w:t>
+              <w:t>3.2 Estratégia Dual Database</w:t>
             </w:r>
           </w:p>
         </w:tc>
@@ -807,7 +848,7 @@
                 <w:rFonts w:ascii="Arial" w:hAnsi="Arial"/>
                 <w:sz w:val="19"/>
               </w:rPr>
-              <w:t>Usuário autenticado na plataforma (adotante de pets ou tutor ativo).</w:t>
+              <w:t>PostgreSQL Relacional + MongoDB NoSQL</w:t>
             </w:r>
           </w:p>
         </w:tc>
@@ -834,7 +875,7 @@
                 <w:rFonts w:ascii="Arial" w:hAnsi="Arial"/>
                 <w:sz w:val="19"/>
               </w:rPr>
-              <w:t>Manifestar interesse em adoção, favoritar pets, realizar doações, acessar e-commerce.</w:t>
+              <w:t>PostgreSQL gerencia as tabelas transacionais ACID (pedidos, pagamentos, assinaturas e agendamentos). MongoDB lida com coleções dinâmicas e de alta vazão (Usuários, Pets, ONGs).</w:t>
             </w:r>
           </w:p>
         </w:tc>
@@ -867,7 +908,7 @@
                 <w:rFonts w:ascii="Arial" w:hAnsi="Arial"/>
                 <w:sz w:val="19"/>
               </w:rPr>
-              <w:t>ONG / Protetor</w:t>
+              <w:t>3.3 Cenário de Alta Escalabilidade</w:t>
             </w:r>
           </w:p>
         </w:tc>
@@ -894,7 +935,7 @@
                 <w:rFonts w:ascii="Arial" w:hAnsi="Arial"/>
                 <w:sz w:val="19"/>
               </w:rPr>
-              <w:t>Organização ou protetor independente aprovado pela administração.</w:t>
+              <w:t>Cache Redis Distribuído + Otimizações de Query</w:t>
             </w:r>
           </w:p>
         </w:tc>
@@ -921,7 +962,7 @@
                 <w:rFonts w:ascii="Arial" w:hAnsi="Arial"/>
                 <w:sz w:val="19"/>
               </w:rPr>
-              <w:t>Cadastrar e gerenciar pets, gerenciar formulários de adoção e atualizar perfil público.</w:t>
+              <w:t>Atendimento à restrição regulamentar (1M escritas / 2M leituras). Implementado cache local e distribuído com Redis, indexação MongoDB e queries JPA otimizadas sem gargalos N+1.</w:t>
             </w:r>
           </w:p>
         </w:tc>
@@ -954,7 +995,7 @@
                 <w:rFonts w:ascii="Arial" w:hAnsi="Arial"/>
                 <w:sz w:val="19"/>
               </w:rPr>
-              <w:t>Parceiro de Serviço</w:t>
+              <w:t>3.4 Comunicação Tempo Real</w:t>
             </w:r>
           </w:p>
         </w:tc>
@@ -981,7 +1022,7 @@
                 <w:rFonts w:ascii="Arial" w:hAnsi="Arial"/>
                 <w:sz w:val="19"/>
               </w:rPr>
-              <w:t>Pet shop, clínica veterinária ou hotel pet cadastrado na plataforma.</w:t>
+              <w:t>Protocolo WebSocket (Chat Adotante-ONG)</w:t>
             </w:r>
           </w:p>
         </w:tc>
@@ -1008,7 +1049,7 @@
                 <w:rFonts w:ascii="Arial" w:hAnsi="Arial"/>
                 <w:sz w:val="19"/>
               </w:rPr>
-              <w:t>Manter catálogo de serviços no guia de serviços, interagir com tutores.</w:t>
+              <w:t>Comunicação full-duplex síncrona. O chat permite que ONGs tirem dúvidas e validem formulários de adoção diretamente com os adotantes de forma instantânea.</w:t>
             </w:r>
           </w:p>
         </w:tc>
@@ -1178,7 +1219,7 @@
                 <w:rFonts w:ascii="Arial" w:hAnsi="Arial"/>
                 <w:sz w:val="19"/>
               </w:rPr>
-              <w:t>Prioridade</w:t>
+              <w:t>Gestão de Estado Cross-DB</w:t>
             </w:r>
           </w:p>
         </w:tc>
@@ -1205,7 +1246,7 @@
                 <w:rFonts w:ascii="Arial" w:hAnsi="Arial"/>
                 <w:sz w:val="19"/>
               </w:rPr>
-              <w:t>Critério de Classificação</w:t>
+              <w:t>O backend gerencia consistência lógica e deleções seguras (Nullify) via código de serviço Java para evitar registros órfãos nas tabelas do PostgreSQL.</w:t>
             </w:r>
           </w:p>
         </w:tc>
@@ -1429,9 +1470,9 @@
             <w:r>
               <w:rPr>
                 <w:rFonts w:ascii="Arial" w:hAnsi="Arial"/>
-                <w:sz w:val="18"/>
-              </w:rPr>
-              <w:t>ID</w:t>
+                <w:sz w:val="19"/>
+              </w:rPr>
+              <w:t>Diagrama UML</w:t>
             </w:r>
           </w:p>
         </w:tc>
@@ -1456,9 +1497,9 @@
             <w:r>
               <w:rPr>
                 <w:rFonts w:ascii="Arial" w:hAnsi="Arial"/>
-                <w:sz w:val="18"/>
-              </w:rPr>
-              <w:t>Descrição do Requisito Funcional</w:t>
+                <w:sz w:val="19"/>
+              </w:rPr>
+              <w:t>Descrição e Finalidade Técnica</w:t>
             </w:r>
           </w:p>
         </w:tc>
@@ -1483,9 +1524,9 @@
             <w:r>
               <w:rPr>
                 <w:rFonts w:ascii="Arial" w:hAnsi="Arial"/>
-                <w:sz w:val="18"/>
-              </w:rPr>
-              <w:t>Prioridade</w:t>
+                <w:sz w:val="19"/>
+              </w:rPr>
+              <w:t>Arquivos Físicos de Modelagem</w:t>
             </w:r>
           </w:p>
         </w:tc>
@@ -1516,9 +1557,9 @@
             <w:r>
               <w:rPr>
                 <w:rFonts w:ascii="Arial" w:hAnsi="Arial"/>
-                <w:sz w:val="18"/>
-              </w:rPr>
-              <w:t>RF-001 UC01</w:t>
+                <w:sz w:val="19"/>
+              </w:rPr>
+              <w:t>4.1 Diagrama de Casos de Uso</w:t>
             </w:r>
           </w:p>
         </w:tc>
@@ -1543,9 +1584,9 @@
             <w:r>
               <w:rPr>
                 <w:rFonts w:ascii="Arial" w:hAnsi="Arial"/>
-                <w:sz w:val="18"/>
-              </w:rPr>
-              <w:t>O  sistema  deve  permitir  o  cadastro  de  novos  usuários  (Adotante/Tutor)  com  nome,  e-mail,  senha  e  telefone,  com  validação  de  e-mail  único.</w:t>
+                <w:sz w:val="19"/>
+              </w:rPr>
+              <w:t>Mapeia as interações e permissões dos atores do sistema com os 8 módulos principais da plataforma.</w:t>
             </w:r>
           </w:p>
         </w:tc>
@@ -1570,9 +1611,9 @@
             <w:r>
               <w:rPr>
                 <w:rFonts w:ascii="Arial" w:hAnsi="Arial"/>
-                <w:sz w:val="18"/>
-              </w:rPr>
-              <w:t>Alta</w:t>
+                <w:sz w:val="19"/>
+              </w:rPr>
+              <w:t>Diagrama de Caso de Usos.pdf / Use Case Att- MyBuddy.pdf</w:t>
             </w:r>
           </w:p>
         </w:tc>
@@ -1603,9 +1644,9 @@
             <w:r>
               <w:rPr>
                 <w:rFonts w:ascii="Arial" w:hAnsi="Arial"/>
-                <w:sz w:val="18"/>
-              </w:rPr>
-              <w:t>RF-002 UC02</w:t>
+                <w:sz w:val="19"/>
+              </w:rPr>
+              <w:t>4.2 Diagramas de Sequência</w:t>
             </w:r>
           </w:p>
         </w:tc>
@@ -1630,9 +1671,9 @@
             <w:r>
               <w:rPr>
                 <w:rFonts w:ascii="Arial" w:hAnsi="Arial"/>
-                <w:sz w:val="18"/>
-              </w:rPr>
-              <w:t>O  sistema  deve  autenticar  usuários  via  Keycloak  (OpenID  Connect),  retornando  token  JWT  de  sessão  com  validade  configurável.</w:t>
+                <w:sz w:val="19"/>
+              </w:rPr>
+              <w:t>Detala a troca de mensagens para fluxos complexos (Login Keycloak, Checkout Mercado Pago, Registro de Adoção).</w:t>
             </w:r>
           </w:p>
         </w:tc>
@@ -1657,9 +1698,9 @@
             <w:r>
               <w:rPr>
                 <w:rFonts w:ascii="Arial" w:hAnsi="Arial"/>
-                <w:sz w:val="18"/>
-              </w:rPr>
-              <w:t>Alta</w:t>
+                <w:sz w:val="19"/>
+              </w:rPr>
+              <w:t>MyBuddy_DiagramasDeSequencia.pdf</w:t>
             </w:r>
           </w:p>
         </w:tc>
@@ -1690,9 +1731,9 @@
             <w:r>
               <w:rPr>
                 <w:rFonts w:ascii="Arial" w:hAnsi="Arial"/>
-                <w:sz w:val="18"/>
-              </w:rPr>
-              <w:t>RF-003 UC03</w:t>
+                <w:sz w:val="19"/>
+              </w:rPr>
+              <w:t>4.3 Diagrama de Classes e DER</w:t>
             </w:r>
           </w:p>
         </w:tc>
@@ -1717,9 +1758,9 @@
             <w:r>
               <w:rPr>
                 <w:rFonts w:ascii="Arial" w:hAnsi="Arial"/>
-                <w:sz w:val="18"/>
-              </w:rPr>
-              <w:t>O  sistema  deve  permitir  a  recuperação  de  senha  via  link  enviado  ao  e-mail  cadastrado,  com  token  de  validade  de  24  horas  gerado  pelo  Keycloak.</w:t>
+                <w:sz w:val="19"/>
+              </w:rPr>
+              <w:t>Modelagem da estrutura orientada a objetos das entidades Java e relacionamentos lógicos/físicos do banco.</w:t>
             </w:r>
           </w:p>
         </w:tc>
@@ -1744,9 +1785,9 @@
             <w:r>
               <w:rPr>
                 <w:rFonts w:ascii="Arial" w:hAnsi="Arial"/>
-                <w:sz w:val="18"/>
-              </w:rPr>
-              <w:t>Alta</w:t>
+                <w:sz w:val="19"/>
+              </w:rPr>
+              <w:t>MyBuddy_DER_Final.jpg / MyBuddy_DER_Final.drawio</w:t>
             </w:r>
           </w:p>
         </w:tc>
@@ -1777,7 +1818,7 @@
             <w:r>
               <w:rPr>
                 <w:rFonts w:ascii="Arial" w:hAnsi="Arial"/>
-                <w:sz w:val="18"/>
+                <w:sz w:val="19"/>
               </w:rPr>
               <w:t>RF-004 UC04</w:t>
             </w:r>
@@ -1804,7 +1845,7 @@
             <w:r>
               <w:rPr>
                 <w:rFonts w:ascii="Arial" w:hAnsi="Arial"/>
-                <w:sz w:val="18"/>
+                <w:sz w:val="19"/>
               </w:rPr>
               <w:t>O  sistema  deve  permitir  que  o  usuário  autenticado  visualize  e  atualize  seus  dados  de  perfil:  nome,  telefone,  endereço  e  foto.</w:t>
             </w:r>
@@ -1831,7 +1872,7 @@
             <w:r>
               <w:rPr>
                 <w:rFonts w:ascii="Arial" w:hAnsi="Arial"/>
-                <w:sz w:val="18"/>
+                <w:sz w:val="19"/>
               </w:rPr>
               <w:t>Média</w:t>
             </w:r>
@@ -1864,7 +1905,7 @@
             <w:r>
               <w:rPr>
                 <w:rFonts w:ascii="Arial" w:hAnsi="Arial"/>
-                <w:sz w:val="18"/>
+                <w:sz w:val="19"/>
               </w:rPr>
               <w:t>RF-005 UC04</w:t>
             </w:r>
@@ -1891,7 +1932,7 @@
             <w:r>
               <w:rPr>
                 <w:rFonts w:ascii="Arial" w:hAnsi="Arial"/>
-                <w:sz w:val="18"/>
+                <w:sz w:val="19"/>
               </w:rPr>
               <w:t>O  sistema  deve  diferenciar  os  perfis  de  acesso  (Adotante,  ONG,  Parceiro,  Lojista,  Admin),  aplicando  controle  de  rotas  e  ações  por  role.</w:t>
             </w:r>
@@ -1918,7 +1959,7 @@
             <w:r>
               <w:rPr>
                 <w:rFonts w:ascii="Arial" w:hAnsi="Arial"/>
-                <w:sz w:val="18"/>
+                <w:sz w:val="19"/>
               </w:rPr>
               <w:t>Alta</w:t>
             </w:r>
@@ -1934,7 +1975,7 @@
             <w:r>
               <w:rPr>
                 <w:rFonts w:ascii="Arial" w:hAnsi="Arial"/>
-                <w:sz w:val="18"/>
+                <w:sz w:val="19"/>
               </w:rPr>
               <w:t>RF-006 UC40</w:t>
             </w:r>
@@ -1948,7 +1989,7 @@
             <w:r>
               <w:rPr>
                 <w:rFonts w:ascii="Arial" w:hAnsi="Arial"/>
-                <w:sz w:val="18"/>
+                <w:sz w:val="19"/>
               </w:rPr>
               <w:t>O  sistema  deve  permitir  que  o  usuário  gerencie  suas  preferências  de  notificação  (e-mail,  push),  com  notificações  críticas  de  segurança  sempre  ativas.</w:t>
             </w:r>
@@ -1962,7 +2003,7 @@
             <w:r>
               <w:rPr>
                 <w:rFonts w:ascii="Arial" w:hAnsi="Arial"/>
-                <w:sz w:val="18"/>
+                <w:sz w:val="19"/>
               </w:rPr>
               <w:t>Média</w:t>
             </w:r>
@@ -1978,7 +2019,7 @@
             <w:r>
               <w:rPr>
                 <w:rFonts w:ascii="Arial" w:hAnsi="Arial"/>
-                <w:sz w:val="18"/>
+                <w:sz w:val="19"/>
               </w:rPr>
               <w:t>RF-007 UC48</w:t>
             </w:r>
@@ -1992,7 +2033,7 @@
             <w:r>
               <w:rPr>
                 <w:rFonts w:ascii="Arial" w:hAnsi="Arial"/>
-                <w:sz w:val="18"/>
+                <w:sz w:val="19"/>
               </w:rPr>
               <w:t>O  sistema  deve  permitir  que  o  usuário  solicite  a  exclusão  da  sua  conta  (LGPD),  anonimizando  dados  pessoais  e  mantendo  registros  transacionais  anonimizados.  Exclusão  bloqueada  se  houver  processos  em  andamento.</w:t>
             </w:r>
@@ -2006,7 +2047,7 @@
             <w:r>
               <w:rPr>
                 <w:rFonts w:ascii="Arial" w:hAnsi="Arial"/>
-                <w:sz w:val="18"/>
+                <w:sz w:val="19"/>
               </w:rPr>
               <w:t>Média</w:t>
             </w:r>
@@ -2022,7 +2063,7 @@
             <w:r>
               <w:rPr>
                 <w:rFonts w:ascii="Arial" w:hAnsi="Arial"/>
-                <w:sz w:val="18"/>
+                <w:sz w:val="19"/>
               </w:rPr>
               <w:t>RF-008 UC05</w:t>
             </w:r>
@@ -2036,7 +2077,7 @@
             <w:r>
               <w:rPr>
                 <w:rFonts w:ascii="Arial" w:hAnsi="Arial"/>
-                <w:sz w:val="18"/>
+                <w:sz w:val="19"/>
               </w:rPr>
               <w:t>O  sistema  deve  permitir  o  cadastro  de  ONGs  e  protetores  com  nome,  CNPJ,  e-mail,  telefone,  endereço,  responsável  e  documentação,  submetendo  a  conta  com  status  'Em  Análise'  para  aprovação  do  Administrador.</w:t>
             </w:r>
@@ -2050,7 +2091,7 @@
             <w:r>
               <w:rPr>
                 <w:rFonts w:ascii="Arial" w:hAnsi="Arial"/>
-                <w:sz w:val="18"/>
+                <w:sz w:val="19"/>
               </w:rPr>
               <w:t>Alta</w:t>
             </w:r>
@@ -2066,7 +2107,7 @@
             <w:r>
               <w:rPr>
                 <w:rFonts w:ascii="Arial" w:hAnsi="Arial"/>
-                <w:sz w:val="18"/>
+                <w:sz w:val="19"/>
               </w:rPr>
               <w:t>RF-009 UC06</w:t>
             </w:r>
@@ -2080,7 +2121,7 @@
             <w:r>
               <w:rPr>
                 <w:rFonts w:ascii="Arial" w:hAnsi="Arial"/>
-                <w:sz w:val="18"/>
+                <w:sz w:val="19"/>
               </w:rPr>
               <w:t>O  sistema  deve  permitir  que  a  ONG  aprovada  atualize  sua  página  pública:  fotos,  descrição,  contatos  e  chave  PIX  para  doação.</w:t>
             </w:r>
@@ -2094,7 +2135,7 @@
             <w:r>
               <w:rPr>
                 <w:rFonts w:ascii="Arial" w:hAnsi="Arial"/>
-                <w:sz w:val="18"/>
+                <w:sz w:val="19"/>
               </w:rPr>
               <w:t>Média</w:t>
             </w:r>
@@ -2110,7 +2151,7 @@
             <w:r>
               <w:rPr>
                 <w:rFonts w:ascii="Arial" w:hAnsi="Arial"/>
-                <w:sz w:val="18"/>
+                <w:sz w:val="19"/>
               </w:rPr>
               <w:t>RF-010 UC43</w:t>
             </w:r>
@@ -2124,7 +2165,7 @@
             <w:r>
               <w:rPr>
                 <w:rFonts w:ascii="Arial" w:hAnsi="Arial"/>
-                <w:sz w:val="18"/>
+                <w:sz w:val="19"/>
               </w:rPr>
               <w:t>O  sistema  deve  fornecer  ao  Administrador  um  painel  de  aprovação  de  cadastros  de  ONG,  com  possibilidade  de  aprovar,  rejeitar  (com  justificativa)  ou  solicitar  complementação  de  documentos.</w:t>
             </w:r>
@@ -2138,7 +2179,7 @@
             <w:r>
               <w:rPr>
                 <w:rFonts w:ascii="Arial" w:hAnsi="Arial"/>
-                <w:sz w:val="18"/>
+                <w:sz w:val="19"/>
               </w:rPr>
               <w:t>Alta</w:t>
             </w:r>
@@ -2154,7 +2195,7 @@
             <w:r>
               <w:rPr>
                 <w:rFonts w:ascii="Arial" w:hAnsi="Arial"/>
-                <w:sz w:val="18"/>
+                <w:sz w:val="19"/>
               </w:rPr>
               <w:t>RF-011 UC05</w:t>
             </w:r>
@@ -2168,7 +2209,7 @@
             <w:r>
               <w:rPr>
                 <w:rFonts w:ascii="Arial" w:hAnsi="Arial"/>
-                <w:sz w:val="18"/>
+                <w:sz w:val="19"/>
               </w:rPr>
               <w:t>O  sistema  deve  enviar  notificação  por  e-mail  à  ONG  informando  o  resultado  da  análise  de  cadastro  (aprovado  ou  rejeitado  com  motivo).</w:t>
             </w:r>
@@ -2182,7 +2223,7 @@
             <w:r>
               <w:rPr>
                 <w:rFonts w:ascii="Arial" w:hAnsi="Arial"/>
-                <w:sz w:val="18"/>
+                <w:sz w:val="19"/>
               </w:rPr>
               <w:t>Média</w:t>
             </w:r>
@@ -2198,7 +2239,7 @@
             <w:r>
               <w:rPr>
                 <w:rFonts w:ascii="Arial" w:hAnsi="Arial"/>
-                <w:sz w:val="18"/>
+                <w:sz w:val="19"/>
               </w:rPr>
               <w:t>RF-012 UC07</w:t>
             </w:r>
@@ -2212,7 +2253,7 @@
             <w:r>
               <w:rPr>
                 <w:rFonts w:ascii="Arial" w:hAnsi="Arial"/>
-                <w:sz w:val="18"/>
+                <w:sz w:val="19"/>
               </w:rPr>
               <w:t>O  sistema  deve  permitir  que  a  ONG  aprovada  cadastre  pets  com:  nome,  espécie,  raça,  porte,  idade,  temperamento,  necessidades  médicas,  indicadores  de  saúde  (vacinado,  castrado,  microchipado),  localização  e  até  3  fotos.</w:t>
             </w:r>
@@ -2226,7 +2267,7 @@
             <w:r>
               <w:rPr>
                 <w:rFonts w:ascii="Arial" w:hAnsi="Arial"/>
-                <w:sz w:val="18"/>
+                <w:sz w:val="19"/>
               </w:rPr>
               <w:t>Alta</w:t>
             </w:r>
@@ -2242,7 +2283,7 @@
             <w:r>
               <w:rPr>
                 <w:rFonts w:ascii="Arial" w:hAnsi="Arial"/>
-                <w:sz w:val="18"/>
+                <w:sz w:val="19"/>
               </w:rPr>
               <w:t>RF-013 UC07</w:t>
             </w:r>
@@ -2256,7 +2297,7 @@
             <w:r>
               <w:rPr>
                 <w:rFonts w:ascii="Arial" w:hAnsi="Arial"/>
-                <w:sz w:val="18"/>
+                <w:sz w:val="19"/>
               </w:rPr>
               <w:t>O  sistema  deve  exigir  ao  menos  uma  foto  obrigatória  para  publicação  do  pet  no  catálogo.</w:t>
             </w:r>
@@ -2270,7 +2311,7 @@
             <w:r>
               <w:rPr>
                 <w:rFonts w:ascii="Arial" w:hAnsi="Arial"/>
-                <w:sz w:val="18"/>
+                <w:sz w:val="19"/>
               </w:rPr>
               <w:t>Alta</w:t>
             </w:r>
@@ -2286,7 +2327,7 @@
             <w:r>
               <w:rPr>
                 <w:rFonts w:ascii="Arial" w:hAnsi="Arial"/>
-                <w:sz w:val="18"/>
+                <w:sz w:val="19"/>
               </w:rPr>
               <w:t>RF-014 UC08</w:t>
             </w:r>
@@ -2300,7 +2341,7 @@
             <w:r>
               <w:rPr>
                 <w:rFonts w:ascii="Arial" w:hAnsi="Arial"/>
-                <w:sz w:val="18"/>
+                <w:sz w:val="19"/>
               </w:rPr>
               <w:t>O  sistema  deve  permitir  que  a  ONG  proprietária  ou  o  Admin  edite  as  informações  e  atualize  o  status  de  adoção  de  um  pet  (Disponível  /  Adotado  /  Inativo).</w:t>
             </w:r>
@@ -2314,7 +2355,7 @@
             <w:r>
               <w:rPr>
                 <w:rFonts w:ascii="Arial" w:hAnsi="Arial"/>
-                <w:sz w:val="18"/>
+                <w:sz w:val="19"/>
               </w:rPr>
               <w:t>Alta</w:t>
             </w:r>
@@ -2330,7 +2371,7 @@
             <w:r>
               <w:rPr>
                 <w:rFonts w:ascii="Arial" w:hAnsi="Arial"/>
-                <w:sz w:val="18"/>
+                <w:sz w:val="19"/>
               </w:rPr>
               <w:t>RF-015 UC09</w:t>
             </w:r>
@@ -2344,7 +2385,7 @@
             <w:r>
               <w:rPr>
                 <w:rFonts w:ascii="Arial" w:hAnsi="Arial"/>
-                <w:sz w:val="18"/>
+                <w:sz w:val="19"/>
               </w:rPr>
               <w:t>O  sistema  deve  exibir  uma  vitrine  paginada  de  pets  disponíveis  para  adoção,  ordenados  por  proximidade  do  usuário.</w:t>
             </w:r>
@@ -2358,7 +2399,7 @@
             <w:r>
               <w:rPr>
                 <w:rFonts w:ascii="Arial" w:hAnsi="Arial"/>
-                <w:sz w:val="18"/>
+                <w:sz w:val="19"/>
               </w:rPr>
               <w:t>Alta</w:t>
             </w:r>
@@ -2374,7 +2415,7 @@
             <w:r>
               <w:rPr>
                 <w:rFonts w:ascii="Arial" w:hAnsi="Arial"/>
-                <w:sz w:val="18"/>
+                <w:sz w:val="19"/>
               </w:rPr>
               <w:t>RF-016 UC10</w:t>
             </w:r>
@@ -2388,7 +2429,7 @@
             <w:r>
               <w:rPr>
                 <w:rFonts w:ascii="Arial" w:hAnsi="Arial"/>
-                <w:sz w:val="18"/>
+                <w:sz w:val="19"/>
               </w:rPr>
               <w:t>O  sistema  deve  oferecer  filtros  avançados  na  vitrine:  espécie,  sexo,  porte,  faixa  etária  e  localização  (cidade/estado).</w:t>
             </w:r>
@@ -2402,7 +2443,7 @@
             <w:r>
               <w:rPr>
                 <w:rFonts w:ascii="Arial" w:hAnsi="Arial"/>
-                <w:sz w:val="18"/>
+                <w:sz w:val="19"/>
               </w:rPr>
               <w:t>Alta</w:t>
             </w:r>
@@ -2418,7 +2459,7 @@
             <w:r>
               <w:rPr>
                 <w:rFonts w:ascii="Arial" w:hAnsi="Arial"/>
-                <w:sz w:val="18"/>
+                <w:sz w:val="19"/>
               </w:rPr>
               <w:t>RF-017 UC11</w:t>
             </w:r>
@@ -2432,7 +2473,7 @@
             <w:r>
               <w:rPr>
                 <w:rFonts w:ascii="Arial" w:hAnsi="Arial"/>
-                <w:sz w:val="18"/>
+                <w:sz w:val="19"/>
               </w:rPr>
               <w:t>O  sistema  deve  exibir  a  ficha  completa  do  pet:  galeria  de  fotos,  histórico,  comportamento,  necessidades  médicas  e  dados  da  ONG  responsável.</w:t>
             </w:r>
@@ -2446,7 +2487,7 @@
             <w:r>
               <w:rPr>
                 <w:rFonts w:ascii="Arial" w:hAnsi="Arial"/>
-                <w:sz w:val="18"/>
+                <w:sz w:val="19"/>
               </w:rPr>
               <w:t>Alta</w:t>
             </w:r>
@@ -2462,7 +2503,7 @@
             <w:r>
               <w:rPr>
                 <w:rFonts w:ascii="Arial" w:hAnsi="Arial"/>
-                <w:sz w:val="18"/>
+                <w:sz w:val="19"/>
               </w:rPr>
               <w:t>RF-018 UC12</w:t>
             </w:r>
@@ -2476,7 +2517,7 @@
             <w:r>
               <w:rPr>
                 <w:rFonts w:ascii="Arial" w:hAnsi="Arial"/>
-                <w:sz w:val="18"/>
+                <w:sz w:val="19"/>
               </w:rPr>
               <w:t>O  sistema  deve  permitir  que  o  usuário  autenticado  favorite  pets,  salvando-os  em  lista  de  interesse  para  consulta  futura.  Visitantes  sem  login  devem  ser  redirecionados  para  cadastro.</w:t>
             </w:r>
@@ -2490,7 +2531,7 @@
             <w:r>
               <w:rPr>
                 <w:rFonts w:ascii="Arial" w:hAnsi="Arial"/>
-                <w:sz w:val="18"/>
+                <w:sz w:val="19"/>
               </w:rPr>
               <w:t>Média</w:t>
             </w:r>
@@ -2506,7 +2547,7 @@
             <w:r>
               <w:rPr>
                 <w:rFonts w:ascii="Arial" w:hAnsi="Arial"/>
-                <w:sz w:val="18"/>
+                <w:sz w:val="19"/>
               </w:rPr>
               <w:t>RF-019 UC13</w:t>
             </w:r>
@@ -2520,7 +2561,7 @@
             <w:r>
               <w:rPr>
                 <w:rFonts w:ascii="Arial" w:hAnsi="Arial"/>
-                <w:sz w:val="18"/>
+                <w:sz w:val="19"/>
               </w:rPr>
               <w:t>O  sistema  deve  permitir  que  o  adotante  preencha  formulário  de  adoção  (questionário  socioeconômico  e  estrutural)  ao  clicar  em  'Quero  Adotar',  com  salvamento  automático  de  rascunho.</w:t>
             </w:r>
@@ -2534,7 +2575,7 @@
             <w:r>
               <w:rPr>
                 <w:rFonts w:ascii="Arial" w:hAnsi="Arial"/>
-                <w:sz w:val="18"/>
+                <w:sz w:val="19"/>
               </w:rPr>
               <w:t>Alta</w:t>
             </w:r>
@@ -2550,7 +2591,7 @@
             <w:r>
               <w:rPr>
                 <w:rFonts w:ascii="Arial" w:hAnsi="Arial"/>
-                <w:sz w:val="18"/>
+                <w:sz w:val="19"/>
               </w:rPr>
               <w:t>RF-020 UC14</w:t>
             </w:r>
@@ -2564,7 +2605,7 @@
             <w:r>
               <w:rPr>
                 <w:rFonts w:ascii="Arial" w:hAnsi="Arial"/>
-                <w:sz w:val="18"/>
+                <w:sz w:val="19"/>
               </w:rPr>
               <w:t>O  sistema  deve  permitir  que  a  ONG  visualize,  analise,  aprove  ou  recuse  pedidos  de  adoção,  com  modal  de  justificativa  obrigatória  na  recusa.</w:t>
             </w:r>
@@ -2578,7 +2619,7 @@
             <w:r>
               <w:rPr>
                 <w:rFonts w:ascii="Arial" w:hAnsi="Arial"/>
-                <w:sz w:val="18"/>
+                <w:sz w:val="19"/>
               </w:rPr>
               <w:t>Alta</w:t>
             </w:r>
@@ -2594,7 +2635,7 @@
             <w:r>
               <w:rPr>
                 <w:rFonts w:ascii="Arial" w:hAnsi="Arial"/>
-                <w:sz w:val="18"/>
+                <w:sz w:val="19"/>
               </w:rPr>
               <w:t>RF-021 UC15</w:t>
             </w:r>
@@ -2608,7 +2649,7 @@
             <w:r>
               <w:rPr>
                 <w:rFonts w:ascii="Arial" w:hAnsi="Arial"/>
-                <w:sz w:val="18"/>
+                <w:sz w:val="19"/>
               </w:rPr>
               <w:t>O  sistema  deve  registrar  a  conclusão  da  adoção,  transferindo  a  posse  virtual  do  pet  para  o  perfil  do  adotante  e  atualizando  o  status  para  'Adotado'.</w:t>
             </w:r>
@@ -2622,7 +2663,7 @@
             <w:r>
               <w:rPr>
                 <w:rFonts w:ascii="Arial" w:hAnsi="Arial"/>
-                <w:sz w:val="18"/>
+                <w:sz w:val="19"/>
               </w:rPr>
               <w:t>Alta</w:t>
             </w:r>
@@ -2638,7 +2679,7 @@
             <w:r>
               <w:rPr>
                 <w:rFonts w:ascii="Arial" w:hAnsi="Arial"/>
-                <w:sz w:val="18"/>
+                <w:sz w:val="19"/>
               </w:rPr>
               <w:t>RF-022 UC19</w:t>
             </w:r>
@@ -2652,7 +2693,7 @@
             <w:r>
               <w:rPr>
                 <w:rFonts w:ascii="Arial" w:hAnsi="Arial"/>
-                <w:sz w:val="18"/>
+                <w:sz w:val="19"/>
               </w:rPr>
               <w:t>O  sistema  deve  permitir  que  a  ONG  registre  acompanhamentos  pós-adoção  (contato,  fotos,  observações)  e  notifique  o  tutor  sobre  o  acompanhamento  realizado.</w:t>
             </w:r>
@@ -2666,7 +2707,7 @@
             <w:r>
               <w:rPr>
                 <w:rFonts w:ascii="Arial" w:hAnsi="Arial"/>
-                <w:sz w:val="18"/>
+                <w:sz w:val="19"/>
               </w:rPr>
               <w:t>Baixa</w:t>
             </w:r>
@@ -2682,7 +2723,7 @@
             <w:r>
               <w:rPr>
                 <w:rFonts w:ascii="Arial" w:hAnsi="Arial"/>
-                <w:sz w:val="18"/>
+                <w:sz w:val="19"/>
               </w:rPr>
               <w:t>RF-023 UC16</w:t>
             </w:r>
@@ -2696,7 +2737,7 @@
             <w:r>
               <w:rPr>
                 <w:rFonts w:ascii="Arial" w:hAnsi="Arial"/>
-                <w:sz w:val="18"/>
+                <w:sz w:val="19"/>
               </w:rPr>
               <w:t>O  sistema  deve  permitir  que  o  usuário  autenticado  realize  doações  monetárias  para  ONGs  via  Mercado  Pago,  com  valores  pré-definidos  ou  personalizados,  gerando  recibo  digital  ao  doador.</w:t>
             </w:r>
@@ -2710,7 +2751,7 @@
             <w:r>
               <w:rPr>
                 <w:rFonts w:ascii="Arial" w:hAnsi="Arial"/>
-                <w:sz w:val="18"/>
+                <w:sz w:val="19"/>
               </w:rPr>
               <w:t>Média</w:t>
             </w:r>
@@ -2726,7 +2767,7 @@
             <w:r>
               <w:rPr>
                 <w:rFonts w:ascii="Arial" w:hAnsi="Arial"/>
-                <w:sz w:val="18"/>
+                <w:sz w:val="19"/>
               </w:rPr>
               <w:t>RF-024 UC17</w:t>
             </w:r>
@@ -2740,7 +2781,7 @@
             <w:r>
               <w:rPr>
                 <w:rFonts w:ascii="Arial" w:hAnsi="Arial"/>
-                <w:sz w:val="18"/>
+                <w:sz w:val="19"/>
               </w:rPr>
               <w:t>O  sistema  deve  exibir  na  página  pública  da  ONG  um  histórico  paginado  de  doações  recebidas  (valor,  data,  identificação  do  doador),  com  controle  de  visibilidade  individual.</w:t>
             </w:r>
@@ -2754,7 +2795,7 @@
             <w:r>
               <w:rPr>
                 <w:rFonts w:ascii="Arial" w:hAnsi="Arial"/>
-                <w:sz w:val="18"/>
+                <w:sz w:val="19"/>
               </w:rPr>
               <w:t>Média</w:t>
             </w:r>
@@ -2770,7 +2811,7 @@
             <w:r>
               <w:rPr>
                 <w:rFonts w:ascii="Arial" w:hAnsi="Arial"/>
-                <w:sz w:val="18"/>
+                <w:sz w:val="19"/>
               </w:rPr>
               <w:t>RF-025 UC18</w:t>
             </w:r>
@@ -2784,7 +2825,7 @@
             <w:r>
               <w:rPr>
                 <w:rFonts w:ascii="Arial" w:hAnsi="Arial"/>
-                <w:sz w:val="18"/>
+                <w:sz w:val="19"/>
               </w:rPr>
               <w:t>O  sistema  deve  permitir  que  o  doador  acesse  o  histórico  completo  de  suas  doações  com  data,  valor,  ONG  beneficiada  e  status  do  pagamento.</w:t>
             </w:r>
@@ -2798,7 +2839,7 @@
             <w:r>
               <w:rPr>
                 <w:rFonts w:ascii="Arial" w:hAnsi="Arial"/>
-                <w:sz w:val="18"/>
+                <w:sz w:val="19"/>
               </w:rPr>
               <w:t>Média</w:t>
             </w:r>
@@ -2814,7 +2855,7 @@
             <w:r>
               <w:rPr>
                 <w:rFonts w:ascii="Arial" w:hAnsi="Arial"/>
-                <w:sz w:val="18"/>
+                <w:sz w:val="19"/>
               </w:rPr>
               <w:t>RF-026 UC20</w:t>
             </w:r>
@@ -2828,7 +2869,7 @@
             <w:r>
               <w:rPr>
                 <w:rFonts w:ascii="Arial" w:hAnsi="Arial"/>
-                <w:sz w:val="18"/>
+                <w:sz w:val="19"/>
               </w:rPr>
               <w:t>O  sistema  deve  prover  canal  de  mensagens  diretas  entre  adotantes  e  ONGs,  com  filtragem  de  conteúdo  ofensivo  e  notificação  do  destinatário  por  e-mail  e  na  plataforma.</w:t>
             </w:r>
@@ -2842,7 +2883,7 @@
             <w:r>
               <w:rPr>
                 <w:rFonts w:ascii="Arial" w:hAnsi="Arial"/>
-                <w:sz w:val="18"/>
+                <w:sz w:val="19"/>
               </w:rPr>
               <w:t>Baixa</w:t>
             </w:r>
@@ -2858,7 +2899,7 @@
             <w:r>
               <w:rPr>
                 <w:rFonts w:ascii="Arial" w:hAnsi="Arial"/>
-                <w:sz w:val="18"/>
+                <w:sz w:val="19"/>
               </w:rPr>
               <w:t>RF-027 UC21</w:t>
             </w:r>
@@ -2872,7 +2913,7 @@
             <w:r>
               <w:rPr>
                 <w:rFonts w:ascii="Arial" w:hAnsi="Arial"/>
-                <w:sz w:val="18"/>
+                <w:sz w:val="19"/>
               </w:rPr>
               <w:t>O  sistema  deve  permitir  o  cadastro  de  empresas  parceiras  (pet  shops,  clínicas,  hotéis)  com  CNPJ,  razão  social,  endereço,  fotos  e  horários,  submetendo  para  aprovação  do  Admin.</w:t>
             </w:r>
@@ -2886,7 +2927,7 @@
             <w:r>
               <w:rPr>
                 <w:rFonts w:ascii="Arial" w:hAnsi="Arial"/>
-                <w:sz w:val="18"/>
+                <w:sz w:val="19"/>
               </w:rPr>
               <w:t>Média</w:t>
             </w:r>
@@ -2902,7 +2943,7 @@
             <w:r>
               <w:rPr>
                 <w:rFonts w:ascii="Arial" w:hAnsi="Arial"/>
-                <w:sz w:val="18"/>
+                <w:sz w:val="19"/>
               </w:rPr>
               <w:t>RF-028 UC22</w:t>
             </w:r>
@@ -2916,7 +2957,7 @@
             <w:r>
               <w:rPr>
                 <w:rFonts w:ascii="Arial" w:hAnsi="Arial"/>
-                <w:sz w:val="18"/>
+                <w:sz w:val="19"/>
               </w:rPr>
               <w:t>O  sistema  deve  permitir  que  o  parceiro  aprovado  atualize  seu  perfil  público:  descrição,  imagens  e  contatos.</w:t>
             </w:r>
@@ -2930,7 +2971,7 @@
             <w:r>
               <w:rPr>
                 <w:rFonts w:ascii="Arial" w:hAnsi="Arial"/>
-                <w:sz w:val="18"/>
+                <w:sz w:val="19"/>
               </w:rPr>
               <w:t>Média</w:t>
             </w:r>
@@ -2946,7 +2987,7 @@
             <w:r>
               <w:rPr>
                 <w:rFonts w:ascii="Arial" w:hAnsi="Arial"/>
-                <w:sz w:val="18"/>
+                <w:sz w:val="19"/>
               </w:rPr>
               <w:t>RF-029 UC23</w:t>
             </w:r>
@@ -2960,7 +3001,7 @@
             <w:r>
               <w:rPr>
                 <w:rFonts w:ascii="Arial" w:hAnsi="Arial"/>
-                <w:sz w:val="18"/>
+                <w:sz w:val="19"/>
               </w:rPr>
               <w:t>O  sistema  deve  permitir  que  o  parceiro  cadastre  serviços  disponíveis  (tipo,  descrição,  preço  médio),  exibidos  na  aba  do  Guia  público.</w:t>
             </w:r>
@@ -2974,7 +3015,7 @@
             <w:r>
               <w:rPr>
                 <w:rFonts w:ascii="Arial" w:hAnsi="Arial"/>
-                <w:sz w:val="18"/>
+                <w:sz w:val="19"/>
               </w:rPr>
               <w:t>Média</w:t>
             </w:r>
@@ -2990,7 +3031,7 @@
             <w:r>
               <w:rPr>
                 <w:rFonts w:ascii="Arial" w:hAnsi="Arial"/>
-                <w:sz w:val="18"/>
+                <w:sz w:val="19"/>
               </w:rPr>
               <w:t>RF-030 UC24</w:t>
             </w:r>
@@ -3004,7 +3045,7 @@
             <w:r>
               <w:rPr>
                 <w:rFonts w:ascii="Arial" w:hAnsi="Arial"/>
-                <w:sz w:val="18"/>
+                <w:sz w:val="19"/>
               </w:rPr>
               <w:t>O  sistema  deve  oferecer  busca  de  serviços  por  termo  e  raio  de  distância,  retornando  estabelecimentos  ordenados  por  proximidade  e  avaliação.</w:t>
             </w:r>
@@ -3018,7 +3059,7 @@
             <w:r>
               <w:rPr>
                 <w:rFonts w:ascii="Arial" w:hAnsi="Arial"/>
-                <w:sz w:val="18"/>
+                <w:sz w:val="19"/>
               </w:rPr>
               <w:t>Média</w:t>
             </w:r>
@@ -3034,7 +3075,7 @@
             <w:r>
               <w:rPr>
                 <w:rFonts w:ascii="Arial" w:hAnsi="Arial"/>
-                <w:sz w:val="18"/>
+                <w:sz w:val="19"/>
               </w:rPr>
               <w:t>RF-031 UC25</w:t>
             </w:r>
@@ -3048,7 +3089,7 @@
             <w:r>
               <w:rPr>
                 <w:rFonts w:ascii="Arial" w:hAnsi="Arial"/>
-                <w:sz w:val="18"/>
+                <w:sz w:val="19"/>
               </w:rPr>
               <w:t>O  sistema  deve  exibir  a  ficha  completa  do  parceiro  com  portfólio,  galeria  de  fotos,  avaliações  e  botão  de  rota  integrado  ao  Google  Maps.</w:t>
             </w:r>
@@ -3062,7 +3103,7 @@
             <w:r>
               <w:rPr>
                 <w:rFonts w:ascii="Arial" w:hAnsi="Arial"/>
-                <w:sz w:val="18"/>
+                <w:sz w:val="19"/>
               </w:rPr>
               <w:t>Média</w:t>
             </w:r>
@@ -3078,7 +3119,7 @@
             <w:r>
               <w:rPr>
                 <w:rFonts w:ascii="Arial" w:hAnsi="Arial"/>
-                <w:sz w:val="18"/>
+                <w:sz w:val="19"/>
               </w:rPr>
               <w:t>RF-032 UC26</w:t>
             </w:r>
@@ -3092,7 +3133,7 @@
             <w:r>
               <w:rPr>
                 <w:rFonts w:ascii="Arial" w:hAnsi="Arial"/>
-                <w:sz w:val="18"/>
+                <w:sz w:val="19"/>
               </w:rPr>
               <w:t>O  sistema  deve  permitir  que  usuários  autenticados  avaliem  parceiros  de  serviço  com  nota  de  1  a  5  estrelas  e  comentário,  com  filtragem  automática  de  linguagem  ofensiva.</w:t>
             </w:r>
@@ -3106,7 +3147,7 @@
             <w:r>
               <w:rPr>
                 <w:rFonts w:ascii="Arial" w:hAnsi="Arial"/>
-                <w:sz w:val="18"/>
+                <w:sz w:val="19"/>
               </w:rPr>
               <w:t>Baixa</w:t>
             </w:r>
@@ -3122,7 +3163,7 @@
             <w:r>
               <w:rPr>
                 <w:rFonts w:ascii="Arial" w:hAnsi="Arial"/>
-                <w:sz w:val="18"/>
+                <w:sz w:val="19"/>
               </w:rPr>
               <w:t>RF-033 UC27</w:t>
             </w:r>
@@ -3136,7 +3177,7 @@
             <w:r>
               <w:rPr>
                 <w:rFonts w:ascii="Arial" w:hAnsi="Arial"/>
-                <w:sz w:val="18"/>
+                <w:sz w:val="19"/>
               </w:rPr>
               <w:t>O  sistema  deve  permitir  que  o  usuário  reporte  problemas  em  parceiros  (denúncia  categorizada),  gerando  ticket  de  alta  prioridade  para  o  Administrador.</w:t>
             </w:r>
@@ -3150,7 +3191,7 @@
             <w:r>
               <w:rPr>
                 <w:rFonts w:ascii="Arial" w:hAnsi="Arial"/>
-                <w:sz w:val="18"/>
+                <w:sz w:val="19"/>
               </w:rPr>
               <w:t>Baixa</w:t>
             </w:r>
@@ -3166,7 +3207,7 @@
             <w:r>
               <w:rPr>
                 <w:rFonts w:ascii="Arial" w:hAnsi="Arial"/>
-                <w:sz w:val="18"/>
+                <w:sz w:val="19"/>
               </w:rPr>
               <w:t>RF-034 UC44</w:t>
             </w:r>
@@ -3180,7 +3221,7 @@
             <w:r>
               <w:rPr>
                 <w:rFonts w:ascii="Arial" w:hAnsi="Arial"/>
-                <w:sz w:val="18"/>
+                <w:sz w:val="19"/>
               </w:rPr>
               <w:t>O  sistema  deve  fornecer  ao  Admin  painel  para  aprovação  e  rejeição  de  cadastros  de  parceiros  de  serviço,  com  validação  de  CNPJ  do  ramo  pet.</w:t>
             </w:r>
@@ -3194,7 +3235,7 @@
             <w:r>
               <w:rPr>
                 <w:rFonts w:ascii="Arial" w:hAnsi="Arial"/>
-                <w:sz w:val="18"/>
+                <w:sz w:val="19"/>
               </w:rPr>
               <w:t>Média</w:t>
             </w:r>
@@ -3210,7 +3251,7 @@
             <w:r>
               <w:rPr>
                 <w:rFonts w:ascii="Arial" w:hAnsi="Arial"/>
-                <w:sz w:val="18"/>
+                <w:sz w:val="19"/>
               </w:rPr>
               <w:t>RF-035 UC28</w:t>
             </w:r>
@@ -3224,7 +3265,7 @@
             <w:r>
               <w:rPr>
                 <w:rFonts w:ascii="Arial" w:hAnsi="Arial"/>
-                <w:sz w:val="18"/>
+                <w:sz w:val="19"/>
               </w:rPr>
               <w:t>O  sistema  deve  permitir  o  cadastro  de  lojistas  com  documentação  fiscal  (CNPJ,  conta  bancária)  e  integrar  com  o  Mercado  Pago  Split  para  habilitação  de  venda  online.</w:t>
             </w:r>
@@ -3238,7 +3279,7 @@
             <w:r>
               <w:rPr>
                 <w:rFonts w:ascii="Arial" w:hAnsi="Arial"/>
-                <w:sz w:val="18"/>
+                <w:sz w:val="19"/>
               </w:rPr>
               <w:t>Baixa</w:t>
             </w:r>
@@ -3254,7 +3295,7 @@
             <w:r>
               <w:rPr>
                 <w:rFonts w:ascii="Arial" w:hAnsi="Arial"/>
-                <w:sz w:val="18"/>
+                <w:sz w:val="19"/>
               </w:rPr>
               <w:t>RF-036 UC29</w:t>
             </w:r>
@@ -3268,7 +3309,7 @@
             <w:r>
               <w:rPr>
                 <w:rFonts w:ascii="Arial" w:hAnsi="Arial"/>
-                <w:sz w:val="18"/>
+                <w:sz w:val="19"/>
               </w:rPr>
               <w:t>O  sistema  deve  permitir  que  lojistas  cadastrem  produtos  com  título,  preço,  variações  (tamanho),  peso  (obrigatório  para  frete),  fotos  e  categorias.</w:t>
             </w:r>
@@ -3282,7 +3323,7 @@
             <w:r>
               <w:rPr>
                 <w:rFonts w:ascii="Arial" w:hAnsi="Arial"/>
-                <w:sz w:val="18"/>
+                <w:sz w:val="19"/>
               </w:rPr>
               <w:t>Baixa</w:t>
             </w:r>
@@ -3298,7 +3339,7 @@
             <w:r>
               <w:rPr>
                 <w:rFonts w:ascii="Arial" w:hAnsi="Arial"/>
-                <w:sz w:val="18"/>
+                <w:sz w:val="19"/>
               </w:rPr>
               <w:t>RF-037 UC30</w:t>
             </w:r>
@@ -3312,7 +3353,7 @@
             <w:r>
               <w:rPr>
                 <w:rFonts w:ascii="Arial" w:hAnsi="Arial"/>
-                <w:sz w:val="18"/>
+                <w:sz w:val="19"/>
               </w:rPr>
               <w:t>O  sistema  deve  controlar  o  estoque  de  produtos,  exibindo  'Esgotado'  e  desabilitando  o  botão  de  compra  quando  o  estoque  zerar.</w:t>
             </w:r>
@@ -3326,7 +3367,7 @@
             <w:r>
               <w:rPr>
                 <w:rFonts w:ascii="Arial" w:hAnsi="Arial"/>
-                <w:sz w:val="18"/>
+                <w:sz w:val="19"/>
               </w:rPr>
               <w:t>Baixa</w:t>
             </w:r>
@@ -3342,7 +3383,7 @@
             <w:r>
               <w:rPr>
                 <w:rFonts w:ascii="Arial" w:hAnsi="Arial"/>
-                <w:sz w:val="18"/>
+                <w:sz w:val="19"/>
               </w:rPr>
               <w:t>RF-038 UC31</w:t>
             </w:r>
@@ -3356,7 +3397,7 @@
             <w:r>
               <w:rPr>
                 <w:rFonts w:ascii="Arial" w:hAnsi="Arial"/>
-                <w:sz w:val="18"/>
+                <w:sz w:val="19"/>
               </w:rPr>
               <w:t>O  sistema  deve  permitir  que  lojistas  configurem  promoções  com  desconto  percentual  e  data  de  validade,  exibindo  badge  promocional  na  interface.</w:t>
             </w:r>
@@ -3370,7 +3411,7 @@
             <w:r>
               <w:rPr>
                 <w:rFonts w:ascii="Arial" w:hAnsi="Arial"/>
-                <w:sz w:val="18"/>
+                <w:sz w:val="19"/>
               </w:rPr>
               <w:t>Baixa</w:t>
             </w:r>
@@ -3386,7 +3427,7 @@
             <w:r>
               <w:rPr>
                 <w:rFonts w:ascii="Arial" w:hAnsi="Arial"/>
-                <w:sz w:val="18"/>
+                <w:sz w:val="19"/>
               </w:rPr>
               <w:t>RF-039 UC32</w:t>
             </w:r>
@@ -3400,7 +3441,7 @@
             <w:r>
               <w:rPr>
                 <w:rFonts w:ascii="Arial" w:hAnsi="Arial"/>
-                <w:sz w:val="18"/>
+                <w:sz w:val="19"/>
               </w:rPr>
               <w:t>O  sistema  deve  exibir  catálogo  de  produtos  com  busca  por  termo  e  navegação  por  categorias  em  grid  paginado.</w:t>
             </w:r>
@@ -3414,7 +3455,7 @@
             <w:r>
               <w:rPr>
                 <w:rFonts w:ascii="Arial" w:hAnsi="Arial"/>
-                <w:sz w:val="18"/>
+                <w:sz w:val="19"/>
               </w:rPr>
               <w:t>Baixa</w:t>
             </w:r>
@@ -3430,7 +3471,7 @@
             <w:r>
               <w:rPr>
                 <w:rFonts w:ascii="Arial" w:hAnsi="Arial"/>
-                <w:sz w:val="18"/>
+                <w:sz w:val="19"/>
               </w:rPr>
               <w:t>RF-040 UC33</w:t>
             </w:r>
@@ -3444,7 +3485,7 @@
             <w:r>
               <w:rPr>
                 <w:rFonts w:ascii="Arial" w:hAnsi="Arial"/>
-                <w:sz w:val="18"/>
+                <w:sz w:val="19"/>
               </w:rPr>
               <w:t>O  sistema  deve  exibir  a  ficha  completa  do  produto  com  galeria,  descrição,  avaliações  e  simulação  de  frete  por  CEP.</w:t>
             </w:r>
@@ -3458,7 +3499,7 @@
             <w:r>
               <w:rPr>
                 <w:rFonts w:ascii="Arial" w:hAnsi="Arial"/>
-                <w:sz w:val="18"/>
+                <w:sz w:val="19"/>
               </w:rPr>
               <w:t>Baixa</w:t>
             </w:r>
@@ -3474,7 +3515,7 @@
             <w:r>
               <w:rPr>
                 <w:rFonts w:ascii="Arial" w:hAnsi="Arial"/>
-                <w:sz w:val="18"/>
+                <w:sz w:val="19"/>
               </w:rPr>
               <w:t>RF-041 UC34</w:t>
             </w:r>
@@ -3488,7 +3529,7 @@
             <w:r>
               <w:rPr>
                 <w:rFonts w:ascii="Arial" w:hAnsi="Arial"/>
-                <w:sz w:val="18"/>
+                <w:sz w:val="19"/>
               </w:rPr>
               <w:t>O  sistema  deve  gerenciar  carrinho  de  compras  com  adição,  remoção  e  ajuste  de  quantidades,  recalculando  o  subtotal  em  tempo  real.</w:t>
             </w:r>
@@ -3502,7 +3543,7 @@
             <w:r>
               <w:rPr>
                 <w:rFonts w:ascii="Arial" w:hAnsi="Arial"/>
-                <w:sz w:val="18"/>
+                <w:sz w:val="19"/>
               </w:rPr>
               <w:t>Baixa</w:t>
             </w:r>
@@ -3518,7 +3559,7 @@
             <w:r>
               <w:rPr>
                 <w:rFonts w:ascii="Arial" w:hAnsi="Arial"/>
-                <w:sz w:val="18"/>
+                <w:sz w:val="19"/>
               </w:rPr>
               <w:t>RF-042 UC36</w:t>
             </w:r>
@@ -3532,7 +3573,7 @@
             <w:r>
               <w:rPr>
                 <w:rFonts w:ascii="Arial" w:hAnsi="Arial"/>
-                <w:sz w:val="18"/>
+                <w:sz w:val="19"/>
               </w:rPr>
               <w:t>O  sistema  deve  oferecer  checkout  multi-step:  confirmação  de  endereço  de  entrega,  seleção  de  método  de  pagamento  e  resumo  totalizador  (itens  +  frete).</w:t>
             </w:r>
@@ -3546,7 +3587,7 @@
             <w:r>
               <w:rPr>
                 <w:rFonts w:ascii="Arial" w:hAnsi="Arial"/>
-                <w:sz w:val="18"/>
+                <w:sz w:val="19"/>
               </w:rPr>
               <w:t>Baixa</w:t>
             </w:r>
@@ -3562,7 +3603,7 @@
             <w:r>
               <w:rPr>
                 <w:rFonts w:ascii="Arial" w:hAnsi="Arial"/>
-                <w:sz w:val="18"/>
+                <w:sz w:val="19"/>
               </w:rPr>
               <w:t>RF-043 UC37</w:t>
             </w:r>
@@ -3576,7 +3617,7 @@
             <w:r>
               <w:rPr>
                 <w:rFonts w:ascii="Arial" w:hAnsi="Arial"/>
-                <w:sz w:val="18"/>
+                <w:sz w:val="19"/>
               </w:rPr>
               <w:t>O  sistema  deve  processar  pagamentos  (Cartão,  PIX,  Boleto)  via  Mercado  Pago  de  forma  tokenizada,  aplicando  Split  Payment  entre  lojistas  e  a  plataforma.</w:t>
             </w:r>
@@ -3590,7 +3631,7 @@
             <w:r>
               <w:rPr>
                 <w:rFonts w:ascii="Arial" w:hAnsi="Arial"/>
-                <w:sz w:val="18"/>
+                <w:sz w:val="19"/>
               </w:rPr>
               <w:t>Baixa</w:t>
             </w:r>
@@ -3606,7 +3647,7 @@
             <w:r>
               <w:rPr>
                 <w:rFonts w:ascii="Arial" w:hAnsi="Arial"/>
-                <w:sz w:val="18"/>
+                <w:sz w:val="19"/>
               </w:rPr>
               <w:t>RF-044 UC38</w:t>
             </w:r>
@@ -3620,7 +3661,7 @@
             <w:r>
               <w:rPr>
                 <w:rFonts w:ascii="Arial" w:hAnsi="Arial"/>
-                <w:sz w:val="18"/>
+                <w:sz w:val="19"/>
               </w:rPr>
               <w:t>O  sistema  deve  permitir  que  o  lojista  atualize  o  status  do  pedido  (Preparando  →  Enviado)  com  código  de  rastreio,  notificando  o  comprador  automaticamente.</w:t>
             </w:r>
@@ -3634,7 +3675,7 @@
             <w:r>
               <w:rPr>
                 <w:rFonts w:ascii="Arial" w:hAnsi="Arial"/>
-                <w:sz w:val="18"/>
+                <w:sz w:val="19"/>
               </w:rPr>
               <w:t>Baixa</w:t>
             </w:r>
@@ -3650,7 +3691,7 @@
             <w:r>
               <w:rPr>
                 <w:rFonts w:ascii="Arial" w:hAnsi="Arial"/>
-                <w:sz w:val="18"/>
+                <w:sz w:val="19"/>
               </w:rPr>
               <w:t>RF-045 UC39</w:t>
             </w:r>
@@ -3664,7 +3705,7 @@
             <w:r>
               <w:rPr>
                 <w:rFonts w:ascii="Arial" w:hAnsi="Arial"/>
-                <w:sz w:val="18"/>
+                <w:sz w:val="19"/>
               </w:rPr>
               <w:t>O  sistema  deve  exibir  ao  comprador  o  histórico  de  pedidos  com  timeline  visual  de  progresso  (Confirmado  →  Preparando  →  Enviado  →  Entregue).</w:t>
             </w:r>
@@ -3678,7 +3719,7 @@
             <w:r>
               <w:rPr>
                 <w:rFonts w:ascii="Arial" w:hAnsi="Arial"/>
-                <w:sz w:val="18"/>
+                <w:sz w:val="19"/>
               </w:rPr>
               <w:t>Baixa</w:t>
             </w:r>
@@ -3694,7 +3735,7 @@
             <w:r>
               <w:rPr>
                 <w:rFonts w:ascii="Arial" w:hAnsi="Arial"/>
-                <w:sz w:val="18"/>
+                <w:sz w:val="19"/>
               </w:rPr>
               <w:t>RF-046 UC41</w:t>
             </w:r>
@@ -3708,7 +3749,7 @@
             <w:r>
               <w:rPr>
                 <w:rFonts w:ascii="Arial" w:hAnsi="Arial"/>
-                <w:sz w:val="18"/>
+                <w:sz w:val="19"/>
               </w:rPr>
               <w:t>O  sistema  deve  permitir  que  o  usuário  avalie  produtos  comprados  com  nota  e  comentário  após  a  entrega,  calculando  a  nova  média  de  avaliação  do  SKU.</w:t>
             </w:r>
@@ -3722,7 +3763,7 @@
             <w:r>
               <w:rPr>
                 <w:rFonts w:ascii="Arial" w:hAnsi="Arial"/>
-                <w:sz w:val="18"/>
+                <w:sz w:val="19"/>
               </w:rPr>
               <w:t>Baixa</w:t>
             </w:r>
@@ -3738,7 +3779,7 @@
             <w:r>
               <w:rPr>
                 <w:rFonts w:ascii="Arial" w:hAnsi="Arial"/>
-                <w:sz w:val="18"/>
+                <w:sz w:val="19"/>
               </w:rPr>
               <w:t>RF-047 UC42</w:t>
             </w:r>
@@ -3752,7 +3793,7 @@
             <w:r>
               <w:rPr>
                 <w:rFonts w:ascii="Arial" w:hAnsi="Arial"/>
-                <w:sz w:val="18"/>
+                <w:sz w:val="19"/>
               </w:rPr>
               <w:t>O  sistema  deve  fornecer  ao  Admin  painel  centralizado  de  pedidos  do  marketplace,  filtráveis  por  status,  data,  lojista  ou  comprador,  com  exportação  paginada.</w:t>
             </w:r>
@@ -3766,7 +3807,7 @@
             <w:r>
               <w:rPr>
                 <w:rFonts w:ascii="Arial" w:hAnsi="Arial"/>
-                <w:sz w:val="18"/>
+                <w:sz w:val="19"/>
               </w:rPr>
               <w:t>Baixa</w:t>
             </w:r>
@@ -3782,7 +3823,7 @@
             <w:r>
               <w:rPr>
                 <w:rFonts w:ascii="Arial" w:hAnsi="Arial"/>
-                <w:sz w:val="18"/>
+                <w:sz w:val="19"/>
               </w:rPr>
               <w:t>RF-048 UC45</w:t>
             </w:r>
@@ -3796,7 +3837,7 @@
             <w:r>
               <w:rPr>
                 <w:rFonts w:ascii="Arial" w:hAnsi="Arial"/>
-                <w:sz w:val="18"/>
+                <w:sz w:val="19"/>
               </w:rPr>
               <w:t>O  sistema  deve  registrar  e  disponibilizar  ao  Admin  logs  de  auditoria  de  ações  críticas  (quem,  o  quê,  quando,  qual  recurso),  com  filtros  combinados  e  exportação.</w:t>
             </w:r>
@@ -3810,7 +3851,7 @@
             <w:r>
               <w:rPr>
                 <w:rFonts w:ascii="Arial" w:hAnsi="Arial"/>
-                <w:sz w:val="18"/>
+                <w:sz w:val="19"/>
               </w:rPr>
               <w:t>Média</w:t>
             </w:r>
@@ -3826,7 +3867,7 @@
             <w:r>
               <w:rPr>
                 <w:rFonts w:ascii="Arial" w:hAnsi="Arial"/>
-                <w:sz w:val="18"/>
+                <w:sz w:val="19"/>
               </w:rPr>
               <w:t>RF-049 UC46</w:t>
             </w:r>
@@ -3840,7 +3881,7 @@
             <w:r>
               <w:rPr>
                 <w:rFonts w:ascii="Arial" w:hAnsi="Arial"/>
-                <w:sz w:val="18"/>
+                <w:sz w:val="19"/>
               </w:rPr>
               <w:t>O  sistema  deve  fornecer  dashboard  de  métricas  de  adoção  ao  Admin:  adoções  mensais,  taxa  de  conclusão  e  retenção,  filtráveis  por  período,  cidade  e  ONG.</w:t>
             </w:r>
@@ -3854,7 +3895,7 @@
             <w:r>
               <w:rPr>
                 <w:rFonts w:ascii="Arial" w:hAnsi="Arial"/>
-                <w:sz w:val="18"/>
+                <w:sz w:val="19"/>
               </w:rPr>
               <w:t>Média</w:t>
             </w:r>
@@ -3870,7 +3911,7 @@
             <w:r>
               <w:rPr>
                 <w:rFonts w:ascii="Arial" w:hAnsi="Arial"/>
-                <w:sz w:val="18"/>
+                <w:sz w:val="19"/>
               </w:rPr>
               <w:t>RF-050 UC47</w:t>
             </w:r>
@@ -3884,7 +3925,7 @@
             <w:r>
               <w:rPr>
                 <w:rFonts w:ascii="Arial" w:hAnsi="Arial"/>
-                <w:sz w:val="18"/>
+                <w:sz w:val="19"/>
               </w:rPr>
               <w:t>O  sistema  deve  permitir  que  o  Admin  suspenda  contas  infratoras  com  justificativa,  revogando  tokens  de  acesso  e  registrando  a  ação  no  log  de  auditoria,  com  possibilidade  de  reversão.</w:t>
             </w:r>
@@ -3898,7 +3939,7 @@
             <w:r>
               <w:rPr>
                 <w:rFonts w:ascii="Arial" w:hAnsi="Arial"/>
-                <w:sz w:val="18"/>
+                <w:sz w:val="19"/>
               </w:rPr>
               <w:t>Média</w:t>
             </w:r>
@@ -3914,7 +3955,7 @@
             <w:r>
               <w:rPr>
                 <w:rFonts w:ascii="Arial" w:hAnsi="Arial"/>
-                <w:sz w:val="18"/>
+                <w:sz w:val="19"/>
               </w:rPr>
               <w:t>RF-051 UC49</w:t>
             </w:r>
@@ -3928,7 +3969,7 @@
             <w:r>
               <w:rPr>
                 <w:rFonts w:ascii="Arial" w:hAnsi="Arial"/>
-                <w:sz w:val="18"/>
+                <w:sz w:val="19"/>
               </w:rPr>
               <w:t>O  sistema  deve  fornecer  ao  Admin  Master  painel  de  configurações  globais:  raio  de  busca  padrão,  limites  de  upload,  taxas  de  comissão  do  marketplace.</w:t>
             </w:r>
@@ -3942,7 +3983,7 @@
             <w:r>
               <w:rPr>
                 <w:rFonts w:ascii="Arial" w:hAnsi="Arial"/>
-                <w:sz w:val="18"/>
+                <w:sz w:val="19"/>
               </w:rPr>
               <w:t>Baixa</w:t>
             </w:r>
@@ -3958,7 +3999,7 @@
             <w:r>
               <w:rPr>
                 <w:rFonts w:ascii="Arial" w:hAnsi="Arial"/>
-                <w:sz w:val="18"/>
+                <w:sz w:val="19"/>
               </w:rPr>
               <w:t>RF-052 UC50</w:t>
             </w:r>
@@ -3972,7 +4013,7 @@
             <w:r>
               <w:rPr>
                 <w:rFonts w:ascii="Arial" w:hAnsi="Arial"/>
-                <w:sz w:val="18"/>
+                <w:sz w:val="19"/>
               </w:rPr>
               <w:t>O  sistema  deve  permitir  que  o  Admin  gerencie  a  árvore  taxonômica  de  categorias  e  tags  do  marketplace  e  guia,  com  proteção  contra  exclusão  de  categorias  com  produtos  associados.</w:t>
             </w:r>
@@ -3986,7 +4027,7 @@
             <w:r>
               <w:rPr>
                 <w:rFonts w:ascii="Arial" w:hAnsi="Arial"/>
-                <w:sz w:val="18"/>
+                <w:sz w:val="19"/>
               </w:rPr>
               <w:t>Baixa</w:t>
             </w:r>
@@ -4109,9 +4150,9 @@
             <w:r>
               <w:rPr>
                 <w:rFonts w:ascii="Arial" w:hAnsi="Arial"/>
-                <w:sz w:val="18"/>
-              </w:rPr>
-              <w:t>ID</w:t>
+                <w:sz w:val="19"/>
+              </w:rPr>
+              <w:t>Interface / Front</w:t>
             </w:r>
           </w:p>
         </w:tc>
@@ -4136,9 +4177,9 @@
             <w:r>
               <w:rPr>
                 <w:rFonts w:ascii="Arial" w:hAnsi="Arial"/>
-                <w:sz w:val="18"/>
-              </w:rPr>
-              <w:t>Categoria</w:t>
+                <w:sz w:val="19"/>
+              </w:rPr>
+              <w:t>Foco em Experiência do Usuário (UX/UI)</w:t>
             </w:r>
           </w:p>
         </w:tc>
@@ -4163,9 +4204,9 @@
             <w:r>
               <w:rPr>
                 <w:rFonts w:ascii="Arial" w:hAnsi="Arial"/>
-                <w:sz w:val="18"/>
-              </w:rPr>
-              <w:t>Descrição do Requisito Não Funcional</w:t>
+                <w:sz w:val="19"/>
+              </w:rPr>
+              <w:t>Estrutura Técnica e Padrão Adotado</w:t>
             </w:r>
           </w:p>
         </w:tc>
@@ -4196,9 +4237,9 @@
             <w:r>
               <w:rPr>
                 <w:rFonts w:ascii="Arial" w:hAnsi="Arial"/>
-                <w:sz w:val="18"/>
-              </w:rPr>
-              <w:t>RNF-001</w:t>
+                <w:sz w:val="19"/>
+              </w:rPr>
+              <w:t>5.1 Design System (Figma)</w:t>
             </w:r>
           </w:p>
         </w:tc>
@@ -4223,9 +4264,9 @@
             <w:r>
               <w:rPr>
                 <w:rFonts w:ascii="Arial" w:hAnsi="Arial"/>
-                <w:sz w:val="18"/>
-              </w:rPr>
-              <w:t>Desempenho</w:t>
+                <w:sz w:val="19"/>
+              </w:rPr>
+              <w:t>Wireframes de alta fidelidade baseados em usabilidade, contraste e consistência visual.</w:t>
             </w:r>
           </w:p>
         </w:tc>
@@ -4250,9 +4291,9 @@
             <w:r>
               <w:rPr>
                 <w:rFonts w:ascii="Arial" w:hAnsi="Arial"/>
-                <w:sz w:val="18"/>
-              </w:rPr>
-              <w:t>Consultas  ao  banco  de  dados  devem  ser  concluídas  em  no  máximo  5  segundos  em  condições  normais  de  operação.  Endpoints  críticos  (busca  de  pets,  catálogo  de  produtos)  devem  ser  otimizados  com  índices  e  eliminação  de  queries  N+1.</w:t>
+                <w:sz w:val="19"/>
+              </w:rPr>
+              <w:t>Figma Link oficial e diretório de cores/tipografias globais no Figma.txt.</w:t>
             </w:r>
           </w:p>
         </w:tc>
@@ -4283,9 +4324,9 @@
             <w:r>
               <w:rPr>
                 <w:rFonts w:ascii="Arial" w:hAnsi="Arial"/>
-                <w:sz w:val="18"/>
-              </w:rPr>
-              <w:t>RNF-002</w:t>
+                <w:sz w:val="19"/>
+              </w:rPr>
+              <w:t>5.2 Aplicação Web (Angular)</w:t>
             </w:r>
           </w:p>
         </w:tc>
@@ -4310,9 +4351,9 @@
             <w:r>
               <w:rPr>
                 <w:rFonts w:ascii="Arial" w:hAnsi="Arial"/>
-                <w:sz w:val="18"/>
-              </w:rPr>
-              <w:t>Desempenho</w:t>
+                <w:sz w:val="19"/>
+              </w:rPr>
+              <w:t>Componentização de telas, rotas lazy-loaded, Route Guards de segurança e consumo de API REST.</w:t>
             </w:r>
           </w:p>
         </w:tc>
@@ -4337,9 +4378,9 @@
             <w:r>
               <w:rPr>
                 <w:rFonts w:ascii="Arial" w:hAnsi="Arial"/>
-                <w:sz w:val="18"/>
-              </w:rPr>
-              <w:t>A  listagem  paginada  de  pets  deve  responder  em  até  2  segundos  para  volume  de  até  1.000  registros.  A  busca  no  marketplace  deve  responder  em  até  3  segundos  para  catálogo  com  até  10.000  SKUs.</w:t>
+                <w:sz w:val="19"/>
+              </w:rPr>
+              <w:t>Estrutura Angular CLI com módulos compartilhados e interceptors HTTP.</w:t>
             </w:r>
           </w:p>
         </w:tc>
@@ -4370,9 +4411,9 @@
             <w:r>
               <w:rPr>
                 <w:rFonts w:ascii="Arial" w:hAnsi="Arial"/>
-                <w:sz w:val="18"/>
-              </w:rPr>
-              <w:t>RNF-003</w:t>
+                <w:sz w:val="19"/>
+              </w:rPr>
+              <w:t>5.3 App Mobile (Flutter)</w:t>
             </w:r>
           </w:p>
         </w:tc>
@@ -4397,9 +4438,9 @@
             <w:r>
               <w:rPr>
                 <w:rFonts w:ascii="Arial" w:hAnsi="Arial"/>
-                <w:sz w:val="18"/>
-              </w:rPr>
-              <w:t>Desempenho</w:t>
+                <w:sz w:val="19"/>
+              </w:rPr>
+              <w:t>Onboarding dinâmico, feeds de pets responsivos e gerenciamento de estado unificado.</w:t>
             </w:r>
           </w:p>
         </w:tc>
@@ -4424,9 +4465,9 @@
             <w:r>
               <w:rPr>
                 <w:rFonts w:ascii="Arial" w:hAnsi="Arial"/>
-                <w:sz w:val="18"/>
-              </w:rPr>
-              <w:t>O  upload  de  imagens  deve  aceitar  arquivos  de  até  5MB  por  arquivo.  Imagens  devem  ser  validadas  (tipo  e  tamanho)  no  servidor  antes  do  armazenamento.</w:t>
+                <w:sz w:val="19"/>
+              </w:rPr>
+              <w:t>Uso do padrão BLoC/Cubit para gerenciamento reativo e injeção de dependências.</w:t>
             </w:r>
           </w:p>
         </w:tc>
@@ -4457,7 +4498,7 @@
             <w:r>
               <w:rPr>
                 <w:rFonts w:ascii="Arial" w:hAnsi="Arial"/>
-                <w:sz w:val="18"/>
+                <w:sz w:val="19"/>
               </w:rPr>
               <w:t>RNF-004</w:t>
             </w:r>
@@ -4484,7 +4525,7 @@
             <w:r>
               <w:rPr>
                 <w:rFonts w:ascii="Arial" w:hAnsi="Arial"/>
-                <w:sz w:val="18"/>
+                <w:sz w:val="19"/>
               </w:rPr>
               <w:t>Desempenho</w:t>
             </w:r>
@@ -4511,7 +4552,7 @@
             <w:r>
               <w:rPr>
                 <w:rFonts w:ascii="Arial" w:hAnsi="Arial"/>
-                <w:sz w:val="18"/>
+                <w:sz w:val="19"/>
               </w:rPr>
               <w:t>Consultas  de  histórico  de  doações  e  pedidos  devem  ser  paginadas  com  lazy  loading,  limitando  o  período  máximo  a  12  meses  para  relatórios  extensos.</w:t>
             </w:r>
@@ -4544,7 +4585,7 @@
             <w:r>
               <w:rPr>
                 <w:rFonts w:ascii="Arial" w:hAnsi="Arial"/>
-                <w:sz w:val="18"/>
+                <w:sz w:val="19"/>
               </w:rPr>
               <w:t>RNF-005</w:t>
             </w:r>
@@ -4571,7 +4612,7 @@
             <w:r>
               <w:rPr>
                 <w:rFonts w:ascii="Arial" w:hAnsi="Arial"/>
-                <w:sz w:val="18"/>
+                <w:sz w:val="19"/>
               </w:rPr>
               <w:t>Segurança</w:t>
             </w:r>
@@ -4598,7 +4639,7 @@
             <w:r>
               <w:rPr>
                 <w:rFonts w:ascii="Arial" w:hAnsi="Arial"/>
-                <w:sz w:val="18"/>
+                <w:sz w:val="19"/>
               </w:rPr>
               <w:t>Todas  as  senhas  de  usuários  devem  ser  armazenadas  com  hash  criptográfico  (BCrypt).  Nenhuma  credencial  deve  ser  armazenada  em  texto  puro.</w:t>
             </w:r>
@@ -4631,7 +4672,7 @@
             <w:r>
               <w:rPr>
                 <w:rFonts w:ascii="Arial" w:hAnsi="Arial"/>
-                <w:sz w:val="18"/>
+                <w:sz w:val="19"/>
               </w:rPr>
               <w:t>RNF-006</w:t>
             </w:r>
@@ -4658,7 +4699,7 @@
             <w:r>
               <w:rPr>
                 <w:rFonts w:ascii="Arial" w:hAnsi="Arial"/>
-                <w:sz w:val="18"/>
+                <w:sz w:val="19"/>
               </w:rPr>
               <w:t>Segurança</w:t>
             </w:r>
@@ -4685,7 +4726,7 @@
             <w:r>
               <w:rPr>
                 <w:rFonts w:ascii="Arial" w:hAnsi="Arial"/>
-                <w:sz w:val="18"/>
+                <w:sz w:val="19"/>
               </w:rPr>
               <w:t>Segredo  JWT,  credenciais  de  banco  de  dados  e  chaves  de  API  (Mercado  Pago,  Keycloak)  devem  ser  configurados  exclusivamente  via  variáveis  de  ambiente,  nunca  hardcoded  no  código-fonte.</w:t>
             </w:r>
@@ -4718,7 +4759,7 @@
             <w:r>
               <w:rPr>
                 <w:rFonts w:ascii="Arial" w:hAnsi="Arial"/>
-                <w:sz w:val="18"/>
+                <w:sz w:val="19"/>
               </w:rPr>
               <w:t>RNF-007</w:t>
             </w:r>
@@ -4745,7 +4786,7 @@
             <w:r>
               <w:rPr>
                 <w:rFonts w:ascii="Arial" w:hAnsi="Arial"/>
-                <w:sz w:val="18"/>
+                <w:sz w:val="19"/>
               </w:rPr>
               <w:t>Segurança</w:t>
             </w:r>
@@ -4772,7 +4813,7 @@
             <w:r>
               <w:rPr>
                 <w:rFonts w:ascii="Arial" w:hAnsi="Arial"/>
-                <w:sz w:val="18"/>
+                <w:sz w:val="19"/>
               </w:rPr>
               <w:t>A  API  deve  implementar  CORS  com  domínios  permitidos  configuráveis  por  ambiente  (desenvolvimento/produção).  Rotas  protegidas  por  role  devem  retornar  HTTP  403  para  acessos  não  autorizados.</w:t>
             </w:r>
@@ -4805,7 +4846,7 @@
             <w:r>
               <w:rPr>
                 <w:rFonts w:ascii="Arial" w:hAnsi="Arial"/>
-                <w:sz w:val="18"/>
+                <w:sz w:val="19"/>
               </w:rPr>
               <w:t>RNF-008</w:t>
             </w:r>
@@ -4832,7 +4873,7 @@
             <w:r>
               <w:rPr>
                 <w:rFonts w:ascii="Arial" w:hAnsi="Arial"/>
-                <w:sz w:val="18"/>
+                <w:sz w:val="19"/>
               </w:rPr>
               <w:t>Segurança</w:t>
             </w:r>
@@ -4859,7 +4900,7 @@
             <w:r>
               <w:rPr>
                 <w:rFonts w:ascii="Arial" w:hAnsi="Arial"/>
-                <w:sz w:val="18"/>
+                <w:sz w:val="19"/>
               </w:rPr>
               <w:t>Dados  de  pagamento  devem  ser  tokenizados  via  SDK  oficial  do  Mercado  Pago  antes  de  qualquer  tráfego,  sem  armazenamento  local  de  dados  sensíveis  de  cartão.</w:t>
             </w:r>
@@ -4875,7 +4916,7 @@
             <w:r>
               <w:rPr>
                 <w:rFonts w:ascii="Arial" w:hAnsi="Arial"/>
-                <w:sz w:val="18"/>
+                <w:sz w:val="19"/>
               </w:rPr>
               <w:t>RNF-009</w:t>
             </w:r>
@@ -4889,7 +4930,7 @@
             <w:r>
               <w:rPr>
                 <w:rFonts w:ascii="Arial" w:hAnsi="Arial"/>
-                <w:sz w:val="18"/>
+                <w:sz w:val="19"/>
               </w:rPr>
               <w:t>Segurança</w:t>
             </w:r>
@@ -4903,7 +4944,7 @@
             <w:r>
               <w:rPr>
                 <w:rFonts w:ascii="Arial" w:hAnsi="Arial"/>
-                <w:sz w:val="18"/>
+                <w:sz w:val="19"/>
               </w:rPr>
               <w:t>O  sistema  deve  implementar  filtros  de  conteúdo  para  mensagens  e  reviews,  bloqueando  palavras  ofensivas.  Ações  de  suspensão  de  conta  devem  ser  auditadas  e  reversíveis  pelo  Admin.</w:t>
             </w:r>
@@ -4919,7 +4960,7 @@
             <w:r>
               <w:rPr>
                 <w:rFonts w:ascii="Arial" w:hAnsi="Arial"/>
-                <w:sz w:val="18"/>
+                <w:sz w:val="19"/>
               </w:rPr>
               <w:t>RNF-010</w:t>
             </w:r>
@@ -4933,7 +4974,7 @@
             <w:r>
               <w:rPr>
                 <w:rFonts w:ascii="Arial" w:hAnsi="Arial"/>
-                <w:sz w:val="18"/>
+                <w:sz w:val="19"/>
               </w:rPr>
               <w:t>Segurança</w:t>
             </w:r>
@@ -4947,7 +4988,7 @@
             <w:r>
               <w:rPr>
                 <w:rFonts w:ascii="Arial" w:hAnsi="Arial"/>
-                <w:sz w:val="18"/>
+                <w:sz w:val="19"/>
               </w:rPr>
               <w:t>Em  conformidade  com  a  LGPD,  o  sistema  deve  suportar  anonimização  de  dados  pessoais  na  exclusão  de  conta,  mantendo  registros  transacionais  anonimizados  para  fins  fiscais  e  de  auditoria.</w:t>
             </w:r>
@@ -4963,7 +5004,7 @@
             <w:r>
               <w:rPr>
                 <w:rFonts w:ascii="Arial" w:hAnsi="Arial"/>
-                <w:sz w:val="18"/>
+                <w:sz w:val="19"/>
               </w:rPr>
               <w:t>RNF-011</w:t>
             </w:r>
@@ -4977,7 +5018,7 @@
             <w:r>
               <w:rPr>
                 <w:rFonts w:ascii="Arial" w:hAnsi="Arial"/>
-                <w:sz w:val="18"/>
+                <w:sz w:val="19"/>
               </w:rPr>
               <w:t>Disponibilidade</w:t>
             </w:r>
@@ -4991,7 +5032,7 @@
             <w:r>
               <w:rPr>
                 <w:rFonts w:ascii="Arial" w:hAnsi="Arial"/>
-                <w:sz w:val="18"/>
+                <w:sz w:val="19"/>
               </w:rPr>
               <w:t>A  aplicação  deve  estar  acessível  por  URL  pública  em  ambiente  de  nuvem  (Railway  ou  Render),  com  backend  respondendo  nos  endpoints  da  API  e  frontend  carregando  corretamente.</w:t>
             </w:r>
@@ -5007,7 +5048,7 @@
             <w:r>
               <w:rPr>
                 <w:rFonts w:ascii="Arial" w:hAnsi="Arial"/>
-                <w:sz w:val="18"/>
+                <w:sz w:val="19"/>
               </w:rPr>
               <w:t>RNF-012</w:t>
             </w:r>
@@ -5021,7 +5062,7 @@
             <w:r>
               <w:rPr>
                 <w:rFonts w:ascii="Arial" w:hAnsi="Arial"/>
-                <w:sz w:val="18"/>
+                <w:sz w:val="19"/>
               </w:rPr>
               <w:t>Disponibilidade</w:t>
             </w:r>
@@ -5035,7 +5076,7 @@
             <w:r>
               <w:rPr>
                 <w:rFonts w:ascii="Arial" w:hAnsi="Arial"/>
-                <w:sz w:val="18"/>
+                <w:sz w:val="19"/>
               </w:rPr>
               <w:t>A  aplicação  deve  ser  containerizada  via  Docker  e  orquestrada  com  Docker  Compose,  garantindo  portabilidade  e  reprodutibilidade  do  ambiente  de  execução.</w:t>
             </w:r>
@@ -5051,7 +5092,7 @@
             <w:r>
               <w:rPr>
                 <w:rFonts w:ascii="Arial" w:hAnsi="Arial"/>
-                <w:sz w:val="18"/>
+                <w:sz w:val="19"/>
               </w:rPr>
               <w:t>RNF-013</w:t>
             </w:r>
@@ -5065,7 +5106,7 @@
             <w:r>
               <w:rPr>
                 <w:rFonts w:ascii="Arial" w:hAnsi="Arial"/>
-                <w:sz w:val="18"/>
+                <w:sz w:val="19"/>
               </w:rPr>
               <w:t>Manutenibilidade</w:t>
             </w:r>
@@ -5079,7 +5120,7 @@
             <w:r>
               <w:rPr>
                 <w:rFonts w:ascii="Arial" w:hAnsi="Arial"/>
-                <w:sz w:val="18"/>
+                <w:sz w:val="19"/>
               </w:rPr>
               <w:t>O  código  backend  deve  atingir  cobertura  mínima  de  70%  nos  testes  automatizados  (unitários  +  integração),  mensurada  via  JaCoCo.  A  suíte  de  testes  não  deve  apresentar  falhas  de  compilação.</w:t>
             </w:r>
@@ -5095,7 +5136,7 @@
             <w:r>
               <w:rPr>
                 <w:rFonts w:ascii="Arial" w:hAnsi="Arial"/>
-                <w:sz w:val="18"/>
+                <w:sz w:val="19"/>
               </w:rPr>
               <w:t>RNF-014</w:t>
             </w:r>
@@ -5109,7 +5150,7 @@
             <w:r>
               <w:rPr>
                 <w:rFonts w:ascii="Arial" w:hAnsi="Arial"/>
-                <w:sz w:val="18"/>
+                <w:sz w:val="19"/>
               </w:rPr>
               <w:t>Manutenibilidade</w:t>
             </w:r>
@@ -5123,7 +5164,7 @@
             <w:r>
               <w:rPr>
                 <w:rFonts w:ascii="Arial" w:hAnsi="Arial"/>
-                <w:sz w:val="18"/>
+                <w:sz w:val="19"/>
               </w:rPr>
               <w:t>O  código  deve  aplicar  Clean  Code:  injeção  de  dependência  por  construtor,  uso  do  Lombok  para  redução  de  boilerplate,  SLF4J/Logback  substituindo  System.out.println  em  produção.</w:t>
             </w:r>
@@ -5139,7 +5180,7 @@
             <w:r>
               <w:rPr>
                 <w:rFonts w:ascii="Arial" w:hAnsi="Arial"/>
-                <w:sz w:val="18"/>
+                <w:sz w:val="19"/>
               </w:rPr>
               <w:t>RNF-015</w:t>
             </w:r>
@@ -5153,7 +5194,7 @@
             <w:r>
               <w:rPr>
                 <w:rFonts w:ascii="Arial" w:hAnsi="Arial"/>
-                <w:sz w:val="18"/>
+                <w:sz w:val="19"/>
               </w:rPr>
               <w:t>Manutenibilidade</w:t>
             </w:r>
@@ -5167,7 +5208,7 @@
             <w:r>
               <w:rPr>
                 <w:rFonts w:ascii="Arial" w:hAnsi="Arial"/>
-                <w:sz w:val="18"/>
+                <w:sz w:val="19"/>
               </w:rPr>
               <w:t>A  API  deve  ter  documentação  automática  via  Swagger/OpenAPI  3.0,  acessível  em  ambiente  de  desenvolvimento  e  homologação.  Ações  críticas  do  sistema  devem  ser  registradas  em  log  de  auditoria  imutável.</w:t>
             </w:r>
@@ -5183,7 +5224,7 @@
             <w:r>
               <w:rPr>
                 <w:rFonts w:ascii="Arial" w:hAnsi="Arial"/>
-                <w:sz w:val="18"/>
+                <w:sz w:val="19"/>
               </w:rPr>
               <w:t>RNF-016</w:t>
             </w:r>
@@ -5197,7 +5238,7 @@
             <w:r>
               <w:rPr>
                 <w:rFonts w:ascii="Arial" w:hAnsi="Arial"/>
-                <w:sz w:val="18"/>
+                <w:sz w:val="19"/>
               </w:rPr>
               <w:t>Usabilidade</w:t>
             </w:r>
@@ -5211,7 +5252,7 @@
             <w:r>
               <w:rPr>
                 <w:rFonts w:ascii="Arial" w:hAnsi="Arial"/>
-                <w:sz w:val="18"/>
+                <w:sz w:val="19"/>
               </w:rPr>
               <w:t>O  frontend  deve  seguir  um  design  system  unificado  após  a  migração  para  Angular,  com  consistência  visual  em  todas  as  telas.  O  app  Flutter  deve  manter  paridade  de  funcionalidades  com  a  versão  web.</w:t>
             </w:r>
@@ -5227,7 +5268,7 @@
             <w:r>
               <w:rPr>
                 <w:rFonts w:ascii="Arial" w:hAnsi="Arial"/>
-                <w:sz w:val="18"/>
+                <w:sz w:val="19"/>
               </w:rPr>
               <w:t>RNF-017</w:t>
             </w:r>
@@ -5241,7 +5282,7 @@
             <w:r>
               <w:rPr>
                 <w:rFonts w:ascii="Arial" w:hAnsi="Arial"/>
-                <w:sz w:val="18"/>
+                <w:sz w:val="19"/>
               </w:rPr>
               <w:t>Usabilidade</w:t>
             </w:r>
@@ -5255,7 +5296,7 @@
             <w:r>
               <w:rPr>
                 <w:rFonts w:ascii="Arial" w:hAnsi="Arial"/>
-                <w:sz w:val="18"/>
+                <w:sz w:val="19"/>
               </w:rPr>
               <w:t>As  telas  principais  (landing  page,  vitrine  de  pets,  detalhes  do  pet,  login,  marketplace)  devem  ser  responsivas  e  funcionais  em  dispositivos  mobile  (resolução  mínima  375px).</w:t>
             </w:r>
@@ -5271,7 +5312,7 @@
             <w:r>
               <w:rPr>
                 <w:rFonts w:ascii="Arial" w:hAnsi="Arial"/>
-                <w:sz w:val="18"/>
+                <w:sz w:val="19"/>
               </w:rPr>
               <w:t>RNF-018</w:t>
             </w:r>
@@ -5285,7 +5326,7 @@
             <w:r>
               <w:rPr>
                 <w:rFonts w:ascii="Arial" w:hAnsi="Arial"/>
-                <w:sz w:val="18"/>
+                <w:sz w:val="19"/>
               </w:rPr>
               <w:t>Usabilidade</w:t>
             </w:r>
@@ -5299,7 +5340,7 @@
             <w:r>
               <w:rPr>
                 <w:rFonts w:ascii="Arial" w:hAnsi="Arial"/>
-                <w:sz w:val="18"/>
+                <w:sz w:val="19"/>
               </w:rPr>
               <w:t>Todos  os  formulários  devem  exibir  mensagens  de  validação  claras  e  específicas  por  campo.  Rascunhos  de  formulários  de  adoção  devem  ser  salvos  automaticamente  para  evitar  perda  de  dados.</w:t>
             </w:r>
@@ -5315,7 +5356,7 @@
             <w:r>
               <w:rPr>
                 <w:rFonts w:ascii="Arial" w:hAnsi="Arial"/>
-                <w:sz w:val="18"/>
+                <w:sz w:val="19"/>
               </w:rPr>
               <w:t>RNF-019</w:t>
             </w:r>
@@ -5329,7 +5370,7 @@
             <w:r>
               <w:rPr>
                 <w:rFonts w:ascii="Arial" w:hAnsi="Arial"/>
-                <w:sz w:val="18"/>
+                <w:sz w:val="19"/>
               </w:rPr>
               <w:t>Usabilidade</w:t>
             </w:r>
@@ -5343,7 +5384,7 @@
             <w:r>
               <w:rPr>
                 <w:rFonts w:ascii="Arial" w:hAnsi="Arial"/>
-                <w:sz w:val="18"/>
+                <w:sz w:val="19"/>
               </w:rPr>
               <w:t>O  sistema  de  busca  deve  exibir  sugestões  de  correção  ortográfica  para  termos  de  pesquisa  com  erro  de  digitação  (ex:  'banuh'  →  'banho').</w:t>
             </w:r>
@@ -5359,7 +5400,7 @@
             <w:r>
               <w:rPr>
                 <w:rFonts w:ascii="Arial" w:hAnsi="Arial"/>
-                <w:sz w:val="18"/>
+                <w:sz w:val="19"/>
               </w:rPr>
               <w:t>RNF-020</w:t>
             </w:r>
@@ -5373,7 +5414,7 @@
             <w:r>
               <w:rPr>
                 <w:rFonts w:ascii="Arial" w:hAnsi="Arial"/>
-                <w:sz w:val="18"/>
+                <w:sz w:val="19"/>
               </w:rPr>
               <w:t>Escalabilidade</w:t>
             </w:r>
@@ -5387,7 +5428,7 @@
             <w:r>
               <w:rPr>
                 <w:rFonts w:ascii="Arial" w:hAnsi="Arial"/>
-                <w:sz w:val="18"/>
+                <w:sz w:val="19"/>
               </w:rPr>
               <w:t>A  arquitetura  stateless  (Keycloak  +  JWT)  deve  permitir  escalabilidade  horizontal  da  API  sem  necessidade  de  sticky  sessions  ou  estado  de  sessão  no  servidor.</w:t>
             </w:r>
@@ -5403,7 +5444,7 @@
             <w:r>
               <w:rPr>
                 <w:rFonts w:ascii="Arial" w:hAnsi="Arial"/>
-                <w:sz w:val="18"/>
+                <w:sz w:val="19"/>
               </w:rPr>
               <w:t>RNF-021</w:t>
             </w:r>
@@ -5417,7 +5458,7 @@
             <w:r>
               <w:rPr>
                 <w:rFonts w:ascii="Arial" w:hAnsi="Arial"/>
-                <w:sz w:val="18"/>
+                <w:sz w:val="19"/>
               </w:rPr>
               <w:t>Escalabilidade</w:t>
             </w:r>
@@ -5431,7 +5472,7 @@
             <w:r>
               <w:rPr>
                 <w:rFonts w:ascii="Arial" w:hAnsi="Arial"/>
-                <w:sz w:val="18"/>
+                <w:sz w:val="19"/>
               </w:rPr>
               <w:t>O  sistema  de  upload  de  imagens  deve  ser  refatorado  para  armazenamento  externo  (AWS  S3  ou  Cloudinary)  em  produção,  eliminando  dependência  do  filesystem  local  entre  deploys.</w:t>
             </w:r>
@@ -5447,7 +5488,7 @@
             <w:r>
               <w:rPr>
                 <w:rFonts w:ascii="Arial" w:hAnsi="Arial"/>
-                <w:sz w:val="18"/>
+                <w:sz w:val="19"/>
               </w:rPr>
               <w:t>RNF-022</w:t>
             </w:r>
@@ -5461,7 +5502,7 @@
             <w:r>
               <w:rPr>
                 <w:rFonts w:ascii="Arial" w:hAnsi="Arial"/>
-                <w:sz w:val="18"/>
+                <w:sz w:val="19"/>
               </w:rPr>
               <w:t>Escalabilidade</w:t>
             </w:r>
@@ -5475,7 +5516,7 @@
             <w:r>
               <w:rPr>
                 <w:rFonts w:ascii="Arial" w:hAnsi="Arial"/>
-                <w:sz w:val="18"/>
+                <w:sz w:val="19"/>
               </w:rPr>
               <w:t>O  módulo  de  marketplace  deve  implementar  controle  de  estoque  com  consistência  eventual,  gerenciando  condições  de  corrida  na  compra  simultânea  de  último  item  disponível.</w:t>
             </w:r>
@@ -5581,26 +5622,14 @@
                 <w:rFonts w:ascii="Arial" w:hAnsi="Arial"/>
                 <w:sz w:val="19"/>
               </w:rPr>
-              <w:t>DIAGRAMA DE CASOS DE USO (SKELETON)</w:t>
-              <w:br/>
-              <w:br/>
-              <w:t>O diagrama representa a interação entre as 5 roles de atores principais (Visitante, Adotante, ONG, Parceiro de Serviço e Administrador) com os casos de uso do sistema MyBuddy.</w:t>
-              <w:br/>
-              <w:br/>
-              <w:t>Principais fluxos modelados:</w:t>
-              <w:br/>
-              <w:t>• Autenticação e Gestão de Contas via Keycloak (UC01 a UC04)</w:t>
-              <w:br/>
-              <w:t>• Cadastro de Pets e Solicitações de Adoção (UC05 a UC20)</w:t>
-              <w:br/>
-              <w:t>• Diretório e Agendamento no Guia de Serviços (UC21 a UC27)</w:t>
-              <w:br/>
-              <w:t>• E-commerce e Split de Pagamentos via Mercado Pago (UC28 a UC41)</w:t>
-              <w:br/>
-              <w:t>• Moderação administrativa e logs de auditoria (UC42 a UC50)</w:t>
-              <w:br/>
-              <w:br/>
-              <w:t>Consulte o arquivo completo de modelagem em: Diagrama de Caso de Usos.pdf</w:t>
+              <w:t>6.1 GESTÃO DE IDENTIDADE (KEYCLOAK)</w:t>
+              <w:br/>
+              <w:br/>
+              <w:t>A segurança da plataforma é descentralizada utilizando o Keycloak como Provedor de Identidade (IdP) compatível com OAuth2 / OIDC:</w:t>
+              <w:br/>
+              <w:t>• Proteção de Rotas: O backend Spring Boot atua como Resource Server, validando tokens JWT emitidos pelo Keycloak.</w:t>
+              <w:br/>
+              <w:t>• Controle de Acesso por Funções (RBAC): O Keycloak gerencia os perfis (Roles) como ROLE_ADMIN, ROLE_ONG e ROLE_ADOTANTE, restringindo rotas de API e elementos do frontend com base nas credenciais de acesso.</w:t>
             </w:r>
           </w:p>
         </w:tc>
@@ -5680,19 +5709,14 @@
                 <w:rFonts w:ascii="Arial" w:hAnsi="Arial"/>
                 <w:sz w:val="19"/>
               </w:rPr>
-              <w:t>DIAGRAMA DE SEQUÊNCIA</w:t>
-              <w:br/>
-              <w:br/>
-              <w:t>Foram documentados os diagramas de sequência dos fluxos mais complexos da plataforma, garantindo clareza na ordem de execução de mensagens e transações:</w:t>
-              <w:br/>
-              <w:t>1. Login com Autenticação OAuth2 / OIDC via Servidor do Keycloak.</w:t>
-              <w:br/>
-              <w:t>2. Manifestação e aprovação de formulários socioeconômicos de adoção (fluxo cruzado MongoDB ↔ PostgreSQL).</w:t>
-              <w:br/>
-              <w:t>3. Checkout do e-commerce com Split Payment via Gateway de Pagamento Mercado Pago.</w:t>
-              <w:br/>
-              <w:br/>
-              <w:t>Consulte o arquivo completo de sequenciamento em: MyBuddy_DiagramasDeSequencia.pdf</w:t>
+              <w:t>6.2 MOTOR FINANCEIRO (MERCADO PAGO)</w:t>
+              <w:br/>
+              <w:br/>
+              <w:t>Integração do motor financeiro utilizando a API do Mercado Pago para doações e marketplace:</w:t>
+              <w:br/>
+              <w:t>• Split de Pagamentos: Para compras no marketplace, o checkout divide automaticamente a comissão da plataforma e o valor devido ao lojista/pet shop.</w:t>
+              <w:br/>
+              <w:t>• Webhooks e Notificações: Implementação de webhook endpoints validados para processar alterações de status de pagamento de forma assíncrona, atualizando pedidos automaticamente.</w:t>
             </w:r>
           </w:p>
         </w:tc>
@@ -5761,21 +5785,16 @@
                 <w:rFonts w:ascii="Arial" w:hAnsi="Arial"/>
                 <w:sz w:val="19"/>
               </w:rPr>
-              <w:t>MODELO ENTIDADE-RELACIONAMENTO (MER) E MODELO FÍSICO</w:t>
-              <w:br/>
-              <w:br/>
-              <w:t>O banco de dados relacional (PostgreSQL) foi modelado com as tabelas transacionais que requerem consistência absoluta ACID. Adicionalmente, os mapeamentos relacionam-se de forma lógica (não física) com as coleções no MongoDB:</w:t>
-              <w:br/>
-              <w:t>• payments (PostgreSQL) -&gt; pet_id e organizacao_id (MongoDB)</w:t>
-              <w:br/>
-              <w:t>• donation_subscriptions (PostgreSQL) -&gt; usuario_id e organizacao_id (MongoDB)</w:t>
-              <w:br/>
-              <w:t>• agendamentos (PostgreSQL) -&gt; cliente_id e pet_id (MongoDB)</w:t>
-              <w:br/>
-              <w:t>• pedidos (PostgreSQL) -&gt; cliente_id (MongoDB)</w:t>
-              <w:br/>
-              <w:br/>
-              <w:t>O arquivo imersivo do diagrama encontra-se em: MyBuddy_DER_Final.jpg</w:t>
+              <w:t>6.3 INFRAESTRUTURA, DOCKER E DEPLOY</w:t>
+              <w:br/>
+              <w:br/>
+              <w:t>Conteinerização completa de serviços para portabilidade e deploy:</w:t>
+              <w:br/>
+              <w:t>• Dockerfile dedicados para compilar e empacotar backend Spring Boot e frontend Angular.</w:t>
+              <w:br/>
+              <w:t>• Docker Compose contendo a orquestração do PostgreSQL, MongoDB, Redis, Keycloak e a aplicação backend, permitindo subir o ecossistema completo localmente com um único comando.</w:t>
+              <w:br/>
+              <w:t>• Configurações de produção prontas para deploy em nuvem (Railway/Render).</w:t>
             </w:r>
           </w:p>
         </w:tc>
@@ -5916,38 +5935,11 @@
             <w:r>
               <w:rPr>
                 <w:rFonts w:ascii="Arial" w:hAnsi="Arial"/>
-                <w:sz w:val="19"/>
-              </w:rPr>
-              <w:t>REGRAS DE NEGÓCIO DO PROJETO</w:t>
-              <w:br/>
-              <w:br/>
-              <w:t>• RN-001: Um  usuário  só  pode  ter  um  único  interesse  ativo  por  pet.  O  sistema  deve  rejeitar  com  erro  de  conflito  (HTTP  409)  qualquer  tentativa  de  duplicação.</w:t>
-              <w:br/>
-              <w:t>• RN-002: Apenas  o  usuário  com  ROLE_ONG  proprietário  da  organização  ou  um  ROLE_ADMIN  pode  editar  ou  gerenciar  os  pets  e  interesses  vinculados  àquela  organização.</w:t>
-              <w:br/>
-              <w:t>• RN-003: O  status  de  adoção  de  um  pet  segue  o  fluxo  unidirecional:  DISPONIVEL  →  ADOTADO.  Pets  com  status  ADOTADO  são  ocultados  dos  filtros  de  busca  padrão.</w:t>
-              <w:br/>
-              <w:t>• RN-004: Ao  marcar  um  pet  como  'Adotado',  o  sistema  deve  exigir  o  e-mail  do  tutor  adotante  para  atrelar  a  posse  virtual  ao  registro  de  adoção.</w:t>
-              <w:br/>
-              <w:t>• RN-005: O  status  de  um  interesse  de  adoção  segue  o  fluxo:  PENDENTE  →  APROVADO  ou  REJEITADO.  Apenas  a  ONG  responsável  ou  o  Admin  pode  alterar  esse  status.  Recusa  exige  justificativa  obrigatória.</w:t>
-              <w:br/>
-              <w:t>• RN-006: CNPJ  e  e-mail  de  contato  de  organizações  e  parceiros  são  únicos  na  plataforma.  O  sistema  deve  rejeitar  cadastros  duplicados  com  mensagem  de  erro  específica.</w:t>
-              <w:br/>
-              <w:t>• RN-007: E-mail  de  usuário  é  único  na  plataforma.  O  sistema  deve  rejeitar  registros  com  e-mails  já  existentes.</w:t>
-              <w:br/>
-              <w:t>• RN-008: Apenas  3  fotos  por  pet  são  permitidas  no  upload  múltiplo.  O  backend  deve  validar  e  rejeitar  requisições  que  excedam  esse  limite.</w:t>
-              <w:br/>
-              <w:t>• RN-009: Desconto  em  produto  do  marketplace  não  pode  exceder  100%  do  preço  original.  O  sistema  deve  rejeitar  configurações  com  valores  inválidos.</w:t>
-              <w:br/>
-              <w:t>• RN-010: Usuário  com  adoções  ou  pedidos  em  andamento  não  pode  solicitar  exclusão  de  conta.  O  sistema  bloqueia  a  ação  e  informa  os  processos  pendentes.</w:t>
-              <w:br/>
-              <w:t>• RN-011: Notificações  críticas  de  segurança  e  transações  financeiras  permanecem  ativas  independentemente  das  preferências  de  notificação  configuradas  pelo  usuário.</w:t>
-              <w:br/>
-              <w:t>• RN-012: Espécie  e  Porte  são  campos  controlados  por  Enum  no  backend  (ex:  CÃO,  GATO;  PEQUENO,  MÉDIO,  GRANDE),  garantindo  consistência  dos  dados.</w:t>
-              <w:br/>
-              <w:t>• RN-013: Avaliações  de  reviews  (parceiros  e  produtos)  são  vinculadas  ao  ID  original  do  pedido  ou  interação,  impedindo  manipulação  de  ratings  por  recadastro.</w:t>
-              <w:br/>
-              <w:t>• RN-014: Apenas  o  ADMIN  possui  permissão  para  excluir  permanentemente  registros  de  usuários,  organizações  ou  pets.  Ações  destrutivas  são  registradas  no  log  de  auditoria.</w:t>
+                <w:sz w:val="18"/>
+              </w:rPr>
+              <w:t>7.1 CRITÉRIOS DE ACEITAÇÃO DO MVP</w:t>
+              <w:br/>
+              <w:br/>
             </w:r>
           </w:p>
         </w:tc>
@@ -5972,12 +5964,20 @@
             <w:r>
               <w:rPr>
                 <w:rFonts w:ascii="Arial" w:hAnsi="Arial"/>
-                <w:sz w:val="19"/>
-              </w:rPr>
-              <w:t>CRITÉRIOS DE ACEITAÇÃO DO MVP</w:t>
-              <w:br/>
-              <w:br/>
-              <w:t>• Autenticação  e  Keycloak Usuário  deve  conseguir  se  cadastrar,  fazer  login  via  Keycloak  e  receber  token  JWT  válido.  Credenciais  inválidas  retornam  HTTP  401.  Recuperação  de  senha  funciona  via  link  por  e-mail. Cadastro  de  Pet ONG  autenticada  deve  cadastrar  pet  com  fotos  obrigatórias.  Pet  deve  aparecer  na  vitrine  paginada  com  todos  os  dados  corretos. Busca  com  Filtros Listagem  deve  retornar  apenas  registros  que  correspondam  aos  filtros  aplicados  (espécie,  porte,  cidade,  estado).  Paginação  deve  funcionar  corretamente. Fluxo  Completo  de  Adoção Adotante  preenche  formulário  de  adoção  →  ONG  visualiza  a  solicitação  →  ONG  aprova  ou  rejeita  →  Adotante  visualiza  status  atualizado  →  Conclusão  registrada  com  pet  marcado  como  Adotado. Controle  de  Acesso  (Roles) Rotas  restritas  por  role  (ONG,  Admin)  retornam  HTTP  403  para  usuários  sem  permissão.  Admin  possui  acesso  total  ao  painel  de  gestão. Gestão  de  Organizações Admin  consegue  aprovar/rejeitar  cadastro  de  ONG.  ONG  recebe  e-mail  com  resultado.  CNPJ/e-mail  duplicados  são  rejeitados. Cobertura  de  Testes Suíte  de  testes  do  backend  atinge  ≥70%  de  cobertura  reportada  pelo  JaCoCo,  sem  falhas  de  compilação  ou  testes  quebrados. Deploy  e  Acesso  Público Aplicação  acessível  por  URL  pública,  com  backend  respondendo  nos  endpoints  da  API  e  frontend  carregando  corretamente  no  browser. Conformidade  LGPD Solicitação  de  exclusão  de  conta  anonimiza  corretamente  os  dados  pessoais.  Contas  com  processos  pendentes  têm  a  exclusão  bloqueada  com  mensagem  informativa.</w:t>
+                <w:sz w:val="18"/>
+              </w:rPr>
+              <w:t>7.2 TESTES AUTOMATIZADOS IMPLEMENTADOS</w:t>
+              <w:br/>
+              <w:t>• Backend (JUnit 5 / Mockito): Testes de serviços, repositórios e controllers, cobrindo deleção segura e consistência cruzada. A cobertura é monitorada via plugin JaCoCo, com cache desativado nos testes (spring.cache.type=none) para independência de rede.</w:t>
+              <w:br/>
+              <w:t>• Frontend: Testes automatizados estruturados para validação de fluxos críticos de rotas e componentes.</w:t>
+              <w:br/>
+              <w:t>• Mobile (Flutter Test): Testes básicos de Widgets e integridade das chamadas de API do cliente Dio.</w:t>
+              <w:br/>
+              <w:br/>
+              <w:t>7.3 DOCUMENTAÇÃO DA API REST (SWAGGER)</w:t>
+              <w:br/>
+              <w:t>O backend expõe a documentação Swagger/OpenAPI 3.0 para consulta e teste rápido de todos os endpoints REST (Auth, Pets, Interesses, Organizacoes).</w:t>
             </w:r>
           </w:p>
         </w:tc>
@@ -6135,12 +6135,22 @@
             <w:r>
               <w:rPr>
                 <w:rFonts w:ascii="Arial" w:hAnsi="Arial"/>
-                <w:sz w:val="19"/>
-              </w:rPr>
-              <w:t>CONCLUSÃO TÉCNICA DO PROJETO</w:t>
-              <w:br/>
-              <w:br/>
-              <w:t>6. REFERÊNCIAS ................................................................................................................................. 8 7. ANEXOS ............................................................................................................................................ 9</w:t>
+                <w:sz w:val="18"/>
+              </w:rPr>
+              <w:t>8.1 METODOLOGIA KANBAN E JIRA</w:t>
+              <w:br/>
+              <w:t>Organização do backlog de desenvolvimento através do Jira. Tarefas priorizadas foram distribuídas em sprints de duas semanas, com reuniões quinzenais de review e retrospectiva para governança de escopo.</w:t>
+              <w:br/>
+              <w:br/>
+              <w:t>8.2 GESTÃO DE CONFIGURAÇÃO E COMMITS (GITHUB)</w:t>
+              <w:br/>
+              <w:t>Estratégia de versionamento rigorosa no GitHub:</w:t>
+              <w:br/>
+              <w:t>• Criação de branches com nomenclatura padrão (ex: MY-37-3.8-Performance-DB).</w:t>
+              <w:br/>
+              <w:t>• Commits descritivos utilizando convenções claras (Conventional Commits).</w:t>
+              <w:br/>
+              <w:t>• Pull Requests exigindo validação de compilação e aprovação do time antes do merge na branch Developer.</w:t>
             </w:r>
           </w:p>
         </w:tc>
@@ -6164,21 +6174,28 @@
             <w:r>
               <w:rPr>
                 <w:rFonts w:ascii="Arial" w:hAnsi="Arial"/>
-                <w:sz w:val="19"/>
-              </w:rPr>
-              <w:t>REFERÊNCIAS BIBLIOGRÁFICAS</w:t>
-              <w:br/>
-              <w:br/>
-              <w:t>• 7. ANEXOS ............................................................................................................................................ 9</w:t>
-              <w:br/>
-              <w:br/>
-              <w:t>CANAIS E ANEXOS DO PROJETO</w:t>
+                <w:sz w:val="18"/>
+              </w:rPr>
+              <w:t>8.3 APONTAMENTO DE HORAS E ROADMAP</w:t>
+              <w:br/>
+              <w:t>• Épico 1 (Setup e Autenticação): 200 horas estimadas e executadas.</w:t>
+              <w:br/>
+              <w:t>• Épico 2 (Adoção, Doações e Flutter): 340 horas planejadas.</w:t>
+              <w:br/>
+              <w:t>• Épico 3 (Marketplace, Otimizações e TCC): 260 horas planejadas.</w:t>
+              <w:br/>
+              <w:br/>
+              <w:t>CONCLUSÃO TÉCNICA E REFERÊNCIAS</w:t>
+              <w:br/>
+              <w:br/>
+              <w:br/>
+              <w:t>ANEXOS E CANAIS</w:t>
               <w:br/>
               <w:t>• Repositório GitHub: https://github.com/EderHenriq/MyBuddy</w:t>
               <w:br/>
-              <w:t>• Organização das Sprint no Jira: https://projetodesoftware420.atlassian.net/jira/software/projects/BUDDY/boards/34</w:t>
-              <w:br/>
-              <w:t>• Drive de Modelagens Complementares: https://drive.google.com/drive/folders/1OEwP3-mNprn7MHA7agHBYxmT8tZzGgO2?usp=sharing</w:t>
+              <w:t>• Projeto Jira: https://projetodesoftware420.atlassian.net/jira/software/projects/BUDDY/boards/34</w:t>
+              <w:br/>
+              <w:t>• Pasta Google Drive: https://drive.google.com/drive/folders/1OEwP3-mNprn7MHA7agHBYxmT8tZzGgO2?usp=sharing</w:t>
             </w:r>
           </w:p>
         </w:tc>

</xml_diff>